<commit_message>
Fix input parsing setup and PDF dependencies
</commit_message>
<xml_diff>
--- a/prompts/prompt - Para v2.0.docx
+++ b/prompts/prompt - Para v2.0.docx
@@ -2512,6 +2512,674 @@
     <w:p>
       <w:pPr>
         <w:spacing w:before="100" w:beforeAutospacing="1" w:after="100" w:afterAutospacing="1" w:line="240" w:lineRule="auto"/>
+        <w:rPr>
+          <w:rFonts w:ascii="Times New Roman" w:eastAsia="Times New Roman" w:hAnsi="Times New Roman" w:cs="Times New Roman"/>
+          <w:sz w:val="24"/>
+          <w:szCs w:val="24"/>
+          <w:lang w:eastAsia="en-IN"/>
+        </w:rPr>
+      </w:pPr>
+      <w:r>
+        <w:rPr>
+          <w:rFonts w:ascii="Times New Roman" w:eastAsia="Times New Roman" w:hAnsi="Times New Roman" w:cs="Times New Roman"/>
+          <w:sz w:val="24"/>
+          <w:szCs w:val="24"/>
+          <w:lang w:eastAsia="en-IN"/>
+        </w:rPr>
+        <w:t>RECALL ANCHORS</w:t>
+      </w:r>
+    </w:p>
+    <w:p>
+      <w:pPr>
+        <w:spacing w:before="100" w:beforeAutospacing="1" w:after="100" w:afterAutospacing="1" w:line="240" w:lineRule="auto"/>
+        <w:rPr>
+          <w:rFonts w:ascii="Times New Roman" w:eastAsia="Times New Roman" w:hAnsi="Times New Roman" w:cs="Times New Roman"/>
+          <w:sz w:val="24"/>
+          <w:szCs w:val="24"/>
+          <w:lang w:eastAsia="en-IN"/>
+        </w:rPr>
+      </w:pPr>
+      <w:r>
+        <w:rPr>
+          <w:rFonts w:ascii="Times New Roman" w:eastAsia="Times New Roman" w:hAnsi="Times New Roman" w:cs="Times New Roman"/>
+          <w:sz w:val="24"/>
+          <w:szCs w:val="24"/>
+          <w:lang w:eastAsia="en-IN"/>
+        </w:rPr>
+        <w:t>Study the editorial thoroughly before answering.</w:t>
+      </w:r>
+    </w:p>
+    <w:p>
+      <w:pPr>
+        <w:spacing w:before="100" w:beforeAutospacing="1" w:after="100" w:afterAutospacing="1" w:line="240" w:lineRule="auto"/>
+        <w:rPr>
+          <w:rFonts w:ascii="Times New Roman" w:eastAsia="Times New Roman" w:hAnsi="Times New Roman" w:cs="Times New Roman"/>
+          <w:sz w:val="24"/>
+          <w:szCs w:val="24"/>
+          <w:lang w:eastAsia="en-IN"/>
+        </w:rPr>
+      </w:pPr>
+      <w:r>
+        <w:rPr>
+          <w:rFonts w:ascii="Times New Roman" w:eastAsia="Times New Roman" w:hAnsi="Times New Roman" w:cs="Times New Roman"/>
+          <w:sz w:val="24"/>
+          <w:szCs w:val="24"/>
+          <w:lang w:eastAsia="en-IN"/>
+        </w:rPr>
+        <w:t>Generate exactly five Recall Anchors that together represent the permanent knowledge structure of the issue. They should collectively support the Knowledge Points, Quick Facts, Mains Answer, and MCQs.</w:t>
+      </w:r>
+    </w:p>
+    <w:p>
+      <w:pPr>
+        <w:spacing w:before="100" w:beforeAutospacing="1" w:after="100" w:afterAutospacing="1" w:line="240" w:lineRule="auto"/>
+        <w:rPr>
+          <w:rFonts w:ascii="Times New Roman" w:eastAsia="Times New Roman" w:hAnsi="Times New Roman" w:cs="Times New Roman"/>
+          <w:sz w:val="24"/>
+          <w:szCs w:val="24"/>
+          <w:lang w:eastAsia="en-IN"/>
+        </w:rPr>
+      </w:pPr>
+      <w:r>
+        <w:rPr>
+          <w:rFonts w:ascii="Times New Roman" w:eastAsia="Times New Roman" w:hAnsi="Times New Roman" w:cs="Times New Roman"/>
+          <w:sz w:val="24"/>
+          <w:szCs w:val="24"/>
+          <w:lang w:eastAsia="en-IN"/>
+        </w:rPr>
+        <w:t>Prefer anchors such as:</w:t>
+      </w:r>
+    </w:p>
+    <w:p>
+      <w:pPr>
+        <w:spacing w:before="100" w:beforeAutospacing="1" w:after="100" w:afterAutospacing="1" w:line="240" w:lineRule="auto"/>
+        <w:rPr>
+          <w:rFonts w:ascii="Times New Roman" w:eastAsia="Times New Roman" w:hAnsi="Times New Roman" w:cs="Times New Roman"/>
+          <w:sz w:val="24"/>
+          <w:szCs w:val="24"/>
+          <w:lang w:eastAsia="en-IN"/>
+        </w:rPr>
+      </w:pPr>
+      <w:r>
+        <w:rPr>
+          <w:rFonts w:ascii="Times New Roman" w:eastAsia="Times New Roman" w:hAnsi="Times New Roman" w:cs="Times New Roman"/>
+          <w:sz w:val="24"/>
+          <w:szCs w:val="24"/>
+          <w:lang w:eastAsia="en-IN"/>
+        </w:rPr>
+        <w:t>• Constitutional Articles</w:t>
+      </w:r>
+      <w:r>
+        <w:rPr>
+          <w:rFonts w:ascii="Times New Roman" w:eastAsia="Times New Roman" w:hAnsi="Times New Roman" w:cs="Times New Roman"/>
+          <w:sz w:val="24"/>
+          <w:szCs w:val="24"/>
+          <w:lang w:eastAsia="en-IN"/>
+        </w:rPr>
+        <w:br/>
+        <w:t>• Acts and Rules</w:t>
+      </w:r>
+      <w:r>
+        <w:rPr>
+          <w:rFonts w:ascii="Times New Roman" w:eastAsia="Times New Roman" w:hAnsi="Times New Roman" w:cs="Times New Roman"/>
+          <w:sz w:val="24"/>
+          <w:szCs w:val="24"/>
+          <w:lang w:eastAsia="en-IN"/>
+        </w:rPr>
+        <w:br/>
+        <w:t>• Committees and Commissions</w:t>
+      </w:r>
+      <w:r>
+        <w:rPr>
+          <w:rFonts w:ascii="Times New Roman" w:eastAsia="Times New Roman" w:hAnsi="Times New Roman" w:cs="Times New Roman"/>
+          <w:sz w:val="24"/>
+          <w:szCs w:val="24"/>
+          <w:lang w:eastAsia="en-IN"/>
+        </w:rPr>
+        <w:br/>
+        <w:t>• Supreme Court Judgments</w:t>
+      </w:r>
+      <w:r>
+        <w:rPr>
+          <w:rFonts w:ascii="Times New Roman" w:eastAsia="Times New Roman" w:hAnsi="Times New Roman" w:cs="Times New Roman"/>
+          <w:sz w:val="24"/>
+          <w:szCs w:val="24"/>
+          <w:lang w:eastAsia="en-IN"/>
+        </w:rPr>
+        <w:br/>
+        <w:t>• Institutions</w:t>
+      </w:r>
+      <w:r>
+        <w:rPr>
+          <w:rFonts w:ascii="Times New Roman" w:eastAsia="Times New Roman" w:hAnsi="Times New Roman" w:cs="Times New Roman"/>
+          <w:sz w:val="24"/>
+          <w:szCs w:val="24"/>
+          <w:lang w:eastAsia="en-IN"/>
+        </w:rPr>
+        <w:br/>
+        <w:t>• Government Schemes</w:t>
+      </w:r>
+      <w:r>
+        <w:rPr>
+          <w:rFonts w:ascii="Times New Roman" w:eastAsia="Times New Roman" w:hAnsi="Times New Roman" w:cs="Times New Roman"/>
+          <w:sz w:val="24"/>
+          <w:szCs w:val="24"/>
+          <w:lang w:eastAsia="en-IN"/>
+        </w:rPr>
+        <w:br/>
+        <w:t>• Reports</w:t>
+      </w:r>
+      <w:r>
+        <w:rPr>
+          <w:rFonts w:ascii="Times New Roman" w:eastAsia="Times New Roman" w:hAnsi="Times New Roman" w:cs="Times New Roman"/>
+          <w:sz w:val="24"/>
+          <w:szCs w:val="24"/>
+          <w:lang w:eastAsia="en-IN"/>
+        </w:rPr>
+        <w:br/>
+        <w:t>• Scientific, Economic or Environmental Concepts</w:t>
+      </w:r>
+      <w:r>
+        <w:rPr>
+          <w:rFonts w:ascii="Times New Roman" w:eastAsia="Times New Roman" w:hAnsi="Times New Roman" w:cs="Times New Roman"/>
+          <w:sz w:val="24"/>
+          <w:szCs w:val="24"/>
+          <w:lang w:eastAsia="en-IN"/>
+        </w:rPr>
+        <w:br/>
+        <w:t>• Technical Terms</w:t>
+      </w:r>
+      <w:r>
+        <w:rPr>
+          <w:rFonts w:ascii="Times New Roman" w:eastAsia="Times New Roman" w:hAnsi="Times New Roman" w:cs="Times New Roman"/>
+          <w:sz w:val="24"/>
+          <w:szCs w:val="24"/>
+          <w:lang w:eastAsia="en-IN"/>
+        </w:rPr>
+        <w:br/>
+        <w:t>• Editorial-specific permanent concepts</w:t>
+      </w:r>
+    </w:p>
+    <w:p>
+      <w:pPr>
+        <w:spacing w:before="100" w:beforeAutospacing="1" w:after="100" w:afterAutospacing="1" w:line="240" w:lineRule="auto"/>
+        <w:rPr>
+          <w:rFonts w:ascii="Times New Roman" w:eastAsia="Times New Roman" w:hAnsi="Times New Roman" w:cs="Times New Roman"/>
+          <w:sz w:val="24"/>
+          <w:szCs w:val="24"/>
+          <w:lang w:eastAsia="en-IN"/>
+        </w:rPr>
+      </w:pPr>
+      <w:r>
+        <w:rPr>
+          <w:rFonts w:ascii="Times New Roman" w:eastAsia="Times New Roman" w:hAnsi="Times New Roman" w:cs="Times New Roman"/>
+          <w:sz w:val="24"/>
+          <w:szCs w:val="24"/>
+          <w:lang w:eastAsia="en-IN"/>
+        </w:rPr>
+        <w:t xml:space="preserve">Each Recall Anchor must contain </w:t>
+      </w:r>
+      <w:r>
+        <w:rPr>
+          <w:rFonts w:ascii="Times New Roman" w:eastAsia="Times New Roman" w:hAnsi="Times New Roman" w:cs="Times New Roman"/>
+          <w:b/>
+          <w:bCs/>
+          <w:sz w:val="24"/>
+          <w:szCs w:val="24"/>
+          <w:lang w:eastAsia="en-IN"/>
+        </w:rPr>
+        <w:t>1–3 words maximum</w:t>
+      </w:r>
+      <w:r>
+        <w:rPr>
+          <w:rFonts w:ascii="Times New Roman" w:eastAsia="Times New Roman" w:hAnsi="Times New Roman" w:cs="Times New Roman"/>
+          <w:sz w:val="24"/>
+          <w:szCs w:val="24"/>
+          <w:lang w:eastAsia="en-IN"/>
+        </w:rPr>
+        <w:t>. Use standard abbreviations or recognised short forms where necessary.</w:t>
+      </w:r>
+    </w:p>
+    <w:p>
+      <w:pPr>
+        <w:spacing w:before="100" w:beforeAutospacing="1" w:after="100" w:afterAutospacing="1" w:line="240" w:lineRule="auto"/>
+        <w:rPr>
+          <w:rFonts w:ascii="Times New Roman" w:eastAsia="Times New Roman" w:hAnsi="Times New Roman" w:cs="Times New Roman"/>
+          <w:sz w:val="24"/>
+          <w:szCs w:val="24"/>
+          <w:lang w:eastAsia="en-IN"/>
+        </w:rPr>
+      </w:pPr>
+      <w:r>
+        <w:rPr>
+          <w:rFonts w:ascii="Times New Roman" w:eastAsia="Times New Roman" w:hAnsi="Times New Roman" w:cs="Times New Roman"/>
+          <w:sz w:val="24"/>
+          <w:szCs w:val="24"/>
+          <w:lang w:eastAsia="en-IN"/>
+        </w:rPr>
+        <w:t>Each anchor should be:</w:t>
+      </w:r>
+    </w:p>
+    <w:p>
+      <w:pPr>
+        <w:spacing w:before="100" w:beforeAutospacing="1" w:after="100" w:afterAutospacing="1" w:line="240" w:lineRule="auto"/>
+        <w:rPr>
+          <w:rFonts w:ascii="Times New Roman" w:eastAsia="Times New Roman" w:hAnsi="Times New Roman" w:cs="Times New Roman"/>
+          <w:sz w:val="24"/>
+          <w:szCs w:val="24"/>
+          <w:lang w:eastAsia="en-IN"/>
+        </w:rPr>
+      </w:pPr>
+      <w:r>
+        <w:rPr>
+          <w:rFonts w:ascii="Times New Roman" w:eastAsia="Times New Roman" w:hAnsi="Times New Roman" w:cs="Times New Roman"/>
+          <w:sz w:val="24"/>
+          <w:szCs w:val="24"/>
+          <w:lang w:eastAsia="en-IN"/>
+        </w:rPr>
+        <w:t>• Distinct</w:t>
+      </w:r>
+      <w:r>
+        <w:rPr>
+          <w:rFonts w:ascii="Times New Roman" w:eastAsia="Times New Roman" w:hAnsi="Times New Roman" w:cs="Times New Roman"/>
+          <w:sz w:val="24"/>
+          <w:szCs w:val="24"/>
+          <w:lang w:eastAsia="en-IN"/>
+        </w:rPr>
+        <w:br/>
+        <w:t>• Information-rich</w:t>
+      </w:r>
+      <w:r>
+        <w:rPr>
+          <w:rFonts w:ascii="Times New Roman" w:eastAsia="Times New Roman" w:hAnsi="Times New Roman" w:cs="Times New Roman"/>
+          <w:sz w:val="24"/>
+          <w:szCs w:val="24"/>
+          <w:lang w:eastAsia="en-IN"/>
+        </w:rPr>
+        <w:br/>
+        <w:t>• Easy to remember</w:t>
+      </w:r>
+      <w:r>
+        <w:rPr>
+          <w:rFonts w:ascii="Times New Roman" w:eastAsia="Times New Roman" w:hAnsi="Times New Roman" w:cs="Times New Roman"/>
+          <w:sz w:val="24"/>
+          <w:szCs w:val="24"/>
+          <w:lang w:eastAsia="en-IN"/>
+        </w:rPr>
+        <w:br/>
+        <w:t xml:space="preserve">• </w:t>
+      </w:r>
+      <w:proofErr w:type="gramStart"/>
+      <w:r>
+        <w:rPr>
+          <w:rFonts w:ascii="Times New Roman" w:eastAsia="Times New Roman" w:hAnsi="Times New Roman" w:cs="Times New Roman"/>
+          <w:sz w:val="24"/>
+          <w:szCs w:val="24"/>
+          <w:lang w:eastAsia="en-IN"/>
+        </w:rPr>
+        <w:t>Educationally</w:t>
+      </w:r>
+      <w:proofErr w:type="gramEnd"/>
+      <w:r>
+        <w:rPr>
+          <w:rFonts w:ascii="Times New Roman" w:eastAsia="Times New Roman" w:hAnsi="Times New Roman" w:cs="Times New Roman"/>
+          <w:sz w:val="24"/>
+          <w:szCs w:val="24"/>
+          <w:lang w:eastAsia="en-IN"/>
+        </w:rPr>
+        <w:t xml:space="preserve"> permanent</w:t>
+      </w:r>
+      <w:r>
+        <w:rPr>
+          <w:rFonts w:ascii="Times New Roman" w:eastAsia="Times New Roman" w:hAnsi="Times New Roman" w:cs="Times New Roman"/>
+          <w:sz w:val="24"/>
+          <w:szCs w:val="24"/>
+          <w:lang w:eastAsia="en-IN"/>
+        </w:rPr>
+        <w:br/>
+        <w:t>• Directly useful for active recall</w:t>
+      </w:r>
+    </w:p>
+    <w:p>
+      <w:pPr>
+        <w:spacing w:before="100" w:beforeAutospacing="1" w:after="100" w:afterAutospacing="1" w:line="240" w:lineRule="auto"/>
+        <w:rPr>
+          <w:rFonts w:ascii="Times New Roman" w:eastAsia="Times New Roman" w:hAnsi="Times New Roman" w:cs="Times New Roman"/>
+          <w:sz w:val="24"/>
+          <w:szCs w:val="24"/>
+          <w:lang w:eastAsia="en-IN"/>
+        </w:rPr>
+      </w:pPr>
+      <w:r>
+        <w:rPr>
+          <w:rFonts w:ascii="Times New Roman" w:eastAsia="Times New Roman" w:hAnsi="Times New Roman" w:cs="Times New Roman"/>
+          <w:sz w:val="24"/>
+          <w:szCs w:val="24"/>
+          <w:lang w:eastAsia="en-IN"/>
+        </w:rPr>
+        <w:t>Avoid generic expressions such as Policy Reform, Implementation, Awareness, Strategy, Measures, Governance, Challenges, Framework, or Capacity Building unless they represent a specific and important concept.</w:t>
+      </w:r>
+    </w:p>
+    <w:p>
+      <w:pPr>
+        <w:spacing w:before="100" w:beforeAutospacing="1" w:after="100" w:afterAutospacing="1" w:line="240" w:lineRule="auto"/>
+        <w:rPr>
+          <w:rFonts w:ascii="Times New Roman" w:eastAsia="Times New Roman" w:hAnsi="Times New Roman" w:cs="Times New Roman"/>
+          <w:sz w:val="24"/>
+          <w:szCs w:val="24"/>
+          <w:lang w:eastAsia="en-IN"/>
+        </w:rPr>
+      </w:pPr>
+      <w:r>
+        <w:rPr>
+          <w:rFonts w:ascii="Times New Roman" w:eastAsia="Times New Roman" w:hAnsi="Times New Roman" w:cs="Times New Roman"/>
+          <w:sz w:val="24"/>
+          <w:szCs w:val="24"/>
+          <w:lang w:eastAsia="en-IN"/>
+        </w:rPr>
+        <w:t>Every Recall Anchor must be meaningfully used at least once elsewhere in the topic through the Knowledge Points, Quick Facts, Mains Answer, or MCQs. Mere synonyms or indirect references do not count.</w:t>
+      </w:r>
+    </w:p>
+    <w:p>
+      <w:pPr>
+        <w:spacing w:before="100" w:beforeAutospacing="1" w:after="100" w:afterAutospacing="1" w:line="240" w:lineRule="auto"/>
+        <w:rPr>
+          <w:rFonts w:ascii="Times New Roman" w:eastAsia="Times New Roman" w:hAnsi="Times New Roman" w:cs="Times New Roman"/>
+          <w:sz w:val="24"/>
+          <w:szCs w:val="24"/>
+          <w:lang w:eastAsia="en-IN"/>
+        </w:rPr>
+      </w:pPr>
+      <w:r>
+        <w:rPr>
+          <w:rFonts w:ascii="Times New Roman" w:eastAsia="Times New Roman" w:hAnsi="Times New Roman" w:cs="Times New Roman"/>
+          <w:sz w:val="24"/>
+          <w:szCs w:val="24"/>
+          <w:lang w:eastAsia="en-IN"/>
+        </w:rPr>
+        <w:t>Before producing the final output, verify internally that:</w:t>
+      </w:r>
+    </w:p>
+    <w:p>
+      <w:pPr>
+        <w:spacing w:before="100" w:beforeAutospacing="1" w:after="100" w:afterAutospacing="1" w:line="240" w:lineRule="auto"/>
+        <w:rPr>
+          <w:rFonts w:ascii="Times New Roman" w:eastAsia="Times New Roman" w:hAnsi="Times New Roman" w:cs="Times New Roman"/>
+          <w:sz w:val="24"/>
+          <w:szCs w:val="24"/>
+          <w:lang w:eastAsia="en-IN"/>
+        </w:rPr>
+      </w:pPr>
+      <w:r>
+        <w:rPr>
+          <w:rFonts w:ascii="MS Gothic" w:eastAsia="MS Gothic" w:hAnsi="MS Gothic" w:cs="MS Gothic" w:hint="eastAsia"/>
+          <w:sz w:val="24"/>
+          <w:szCs w:val="24"/>
+          <w:lang w:eastAsia="en-IN"/>
+        </w:rPr>
+        <w:t>✓</w:t>
+      </w:r>
+      <w:r>
+        <w:rPr>
+          <w:rFonts w:ascii="Times New Roman" w:eastAsia="Times New Roman" w:hAnsi="Times New Roman" w:cs="Times New Roman"/>
+          <w:sz w:val="24"/>
+          <w:szCs w:val="24"/>
+          <w:lang w:eastAsia="en-IN"/>
+        </w:rPr>
+        <w:t xml:space="preserve"> </w:t>
+      </w:r>
+      <w:proofErr w:type="gramStart"/>
+      <w:r>
+        <w:rPr>
+          <w:rFonts w:ascii="Times New Roman" w:eastAsia="Times New Roman" w:hAnsi="Times New Roman" w:cs="Times New Roman"/>
+          <w:sz w:val="24"/>
+          <w:szCs w:val="24"/>
+          <w:lang w:eastAsia="en-IN"/>
+        </w:rPr>
+        <w:t>Exactly</w:t>
+      </w:r>
+      <w:proofErr w:type="gramEnd"/>
+      <w:r>
+        <w:rPr>
+          <w:rFonts w:ascii="Times New Roman" w:eastAsia="Times New Roman" w:hAnsi="Times New Roman" w:cs="Times New Roman"/>
+          <w:sz w:val="24"/>
+          <w:szCs w:val="24"/>
+          <w:lang w:eastAsia="en-IN"/>
+        </w:rPr>
+        <w:t xml:space="preserve"> five anchors are present.</w:t>
+      </w:r>
+      <w:r>
+        <w:rPr>
+          <w:rFonts w:ascii="Times New Roman" w:eastAsia="Times New Roman" w:hAnsi="Times New Roman" w:cs="Times New Roman"/>
+          <w:sz w:val="24"/>
+          <w:szCs w:val="24"/>
+          <w:lang w:eastAsia="en-IN"/>
+        </w:rPr>
+        <w:br/>
+      </w:r>
+      <w:r>
+        <w:rPr>
+          <w:rFonts w:ascii="MS Gothic" w:eastAsia="MS Gothic" w:hAnsi="MS Gothic" w:cs="MS Gothic" w:hint="eastAsia"/>
+          <w:sz w:val="24"/>
+          <w:szCs w:val="24"/>
+          <w:lang w:eastAsia="en-IN"/>
+        </w:rPr>
+        <w:t>✓</w:t>
+      </w:r>
+      <w:r>
+        <w:rPr>
+          <w:rFonts w:ascii="Times New Roman" w:eastAsia="Times New Roman" w:hAnsi="Times New Roman" w:cs="Times New Roman"/>
+          <w:sz w:val="24"/>
+          <w:szCs w:val="24"/>
+          <w:lang w:eastAsia="en-IN"/>
+        </w:rPr>
+        <w:t xml:space="preserve"> </w:t>
+      </w:r>
+      <w:proofErr w:type="gramStart"/>
+      <w:r>
+        <w:rPr>
+          <w:rFonts w:ascii="Times New Roman" w:eastAsia="Times New Roman" w:hAnsi="Times New Roman" w:cs="Times New Roman"/>
+          <w:sz w:val="24"/>
+          <w:szCs w:val="24"/>
+          <w:lang w:eastAsia="en-IN"/>
+        </w:rPr>
+        <w:t>Every</w:t>
+      </w:r>
+      <w:proofErr w:type="gramEnd"/>
+      <w:r>
+        <w:rPr>
+          <w:rFonts w:ascii="Times New Roman" w:eastAsia="Times New Roman" w:hAnsi="Times New Roman" w:cs="Times New Roman"/>
+          <w:sz w:val="24"/>
+          <w:szCs w:val="24"/>
+          <w:lang w:eastAsia="en-IN"/>
+        </w:rPr>
+        <w:t xml:space="preserve"> anchor contains 1–3 words.</w:t>
+      </w:r>
+      <w:r>
+        <w:rPr>
+          <w:rFonts w:ascii="Times New Roman" w:eastAsia="Times New Roman" w:hAnsi="Times New Roman" w:cs="Times New Roman"/>
+          <w:sz w:val="24"/>
+          <w:szCs w:val="24"/>
+          <w:lang w:eastAsia="en-IN"/>
+        </w:rPr>
+        <w:br/>
+      </w:r>
+      <w:r>
+        <w:rPr>
+          <w:rFonts w:ascii="MS Gothic" w:eastAsia="MS Gothic" w:hAnsi="MS Gothic" w:cs="MS Gothic" w:hint="eastAsia"/>
+          <w:sz w:val="24"/>
+          <w:szCs w:val="24"/>
+          <w:lang w:eastAsia="en-IN"/>
+        </w:rPr>
+        <w:t>✓</w:t>
+      </w:r>
+      <w:r>
+        <w:rPr>
+          <w:rFonts w:ascii="Times New Roman" w:eastAsia="Times New Roman" w:hAnsi="Times New Roman" w:cs="Times New Roman"/>
+          <w:sz w:val="24"/>
+          <w:szCs w:val="24"/>
+          <w:lang w:eastAsia="en-IN"/>
+        </w:rPr>
+        <w:t xml:space="preserve"> </w:t>
+      </w:r>
+      <w:proofErr w:type="gramStart"/>
+      <w:r>
+        <w:rPr>
+          <w:rFonts w:ascii="Times New Roman" w:eastAsia="Times New Roman" w:hAnsi="Times New Roman" w:cs="Times New Roman"/>
+          <w:sz w:val="24"/>
+          <w:szCs w:val="24"/>
+          <w:lang w:eastAsia="en-IN"/>
+        </w:rPr>
+        <w:t>Every</w:t>
+      </w:r>
+      <w:proofErr w:type="gramEnd"/>
+      <w:r>
+        <w:rPr>
+          <w:rFonts w:ascii="Times New Roman" w:eastAsia="Times New Roman" w:hAnsi="Times New Roman" w:cs="Times New Roman"/>
+          <w:sz w:val="24"/>
+          <w:szCs w:val="24"/>
+          <w:lang w:eastAsia="en-IN"/>
+        </w:rPr>
+        <w:t xml:space="preserve"> anchor is meaningful and information-rich.</w:t>
+      </w:r>
+      <w:r>
+        <w:rPr>
+          <w:rFonts w:ascii="Times New Roman" w:eastAsia="Times New Roman" w:hAnsi="Times New Roman" w:cs="Times New Roman"/>
+          <w:sz w:val="24"/>
+          <w:szCs w:val="24"/>
+          <w:lang w:eastAsia="en-IN"/>
+        </w:rPr>
+        <w:br/>
+      </w:r>
+      <w:r>
+        <w:rPr>
+          <w:rFonts w:ascii="MS Gothic" w:eastAsia="MS Gothic" w:hAnsi="MS Gothic" w:cs="MS Gothic" w:hint="eastAsia"/>
+          <w:sz w:val="24"/>
+          <w:szCs w:val="24"/>
+          <w:lang w:eastAsia="en-IN"/>
+        </w:rPr>
+        <w:lastRenderedPageBreak/>
+        <w:t>✓</w:t>
+      </w:r>
+      <w:r>
+        <w:rPr>
+          <w:rFonts w:ascii="Times New Roman" w:eastAsia="Times New Roman" w:hAnsi="Times New Roman" w:cs="Times New Roman"/>
+          <w:sz w:val="24"/>
+          <w:szCs w:val="24"/>
+          <w:lang w:eastAsia="en-IN"/>
+        </w:rPr>
+        <w:t xml:space="preserve"> </w:t>
+      </w:r>
+      <w:proofErr w:type="gramStart"/>
+      <w:r>
+        <w:rPr>
+          <w:rFonts w:ascii="Times New Roman" w:eastAsia="Times New Roman" w:hAnsi="Times New Roman" w:cs="Times New Roman"/>
+          <w:sz w:val="24"/>
+          <w:szCs w:val="24"/>
+          <w:lang w:eastAsia="en-IN"/>
+        </w:rPr>
+        <w:t>Every</w:t>
+      </w:r>
+      <w:proofErr w:type="gramEnd"/>
+      <w:r>
+        <w:rPr>
+          <w:rFonts w:ascii="Times New Roman" w:eastAsia="Times New Roman" w:hAnsi="Times New Roman" w:cs="Times New Roman"/>
+          <w:sz w:val="24"/>
+          <w:szCs w:val="24"/>
+          <w:lang w:eastAsia="en-IN"/>
+        </w:rPr>
+        <w:t xml:space="preserve"> anchor is meaningfully used elsewhere in the topic.</w:t>
+      </w:r>
+      <w:r>
+        <w:rPr>
+          <w:rFonts w:ascii="Times New Roman" w:eastAsia="Times New Roman" w:hAnsi="Times New Roman" w:cs="Times New Roman"/>
+          <w:sz w:val="24"/>
+          <w:szCs w:val="24"/>
+          <w:lang w:eastAsia="en-IN"/>
+        </w:rPr>
+        <w:br/>
+      </w:r>
+      <w:r>
+        <w:rPr>
+          <w:rFonts w:ascii="MS Gothic" w:eastAsia="MS Gothic" w:hAnsi="MS Gothic" w:cs="MS Gothic" w:hint="eastAsia"/>
+          <w:sz w:val="24"/>
+          <w:szCs w:val="24"/>
+          <w:lang w:eastAsia="en-IN"/>
+        </w:rPr>
+        <w:t>✓</w:t>
+      </w:r>
+      <w:r>
+        <w:rPr>
+          <w:rFonts w:ascii="Times New Roman" w:eastAsia="Times New Roman" w:hAnsi="Times New Roman" w:cs="Times New Roman"/>
+          <w:sz w:val="24"/>
+          <w:szCs w:val="24"/>
+          <w:lang w:eastAsia="en-IN"/>
+        </w:rPr>
+        <w:t xml:space="preserve"> No anchor exists only as an isolated keyword.</w:t>
+      </w:r>
+    </w:p>
+    <w:p>
+      <w:pPr>
+        <w:spacing w:before="100" w:beforeAutospacing="1" w:after="100" w:afterAutospacing="1" w:line="240" w:lineRule="auto"/>
+        <w:rPr>
+          <w:rFonts w:ascii="Times New Roman" w:eastAsia="Times New Roman" w:hAnsi="Times New Roman" w:cs="Times New Roman"/>
+          <w:sz w:val="24"/>
+          <w:szCs w:val="24"/>
+          <w:lang w:eastAsia="en-IN"/>
+        </w:rPr>
+      </w:pPr>
+      <w:r>
+        <w:rPr>
+          <w:rFonts w:ascii="Times New Roman" w:eastAsia="Times New Roman" w:hAnsi="Times New Roman" w:cs="Times New Roman"/>
+          <w:sz w:val="24"/>
+          <w:szCs w:val="24"/>
+          <w:lang w:eastAsia="en-IN"/>
+        </w:rPr>
+        <w:t>If any condition fails, silently regenerate only the affected anchor.</w:t>
+      </w:r>
+    </w:p>
+    <w:p>
+      <w:pPr>
+        <w:spacing w:before="100" w:beforeAutospacing="1" w:after="100" w:afterAutospacing="1" w:line="240" w:lineRule="auto"/>
+        <w:rPr>
+          <w:rFonts w:ascii="Times New Roman" w:eastAsia="Times New Roman" w:hAnsi="Times New Roman" w:cs="Times New Roman"/>
+          <w:sz w:val="24"/>
+          <w:szCs w:val="24"/>
+          <w:lang w:eastAsia="en-IN"/>
+        </w:rPr>
+      </w:pPr>
+      <w:r>
+        <w:rPr>
+          <w:rFonts w:ascii="Times New Roman" w:eastAsia="Times New Roman" w:hAnsi="Times New Roman" w:cs="Times New Roman"/>
+          <w:sz w:val="24"/>
+          <w:szCs w:val="24"/>
+          <w:lang w:eastAsia="en-IN"/>
+        </w:rPr>
+        <w:t>Produce only the final validated five Recall Anchors.</w:t>
+      </w:r>
+    </w:p>
+    <w:p>
+      <w:pPr>
+        <w:spacing w:before="100" w:beforeAutospacing="1" w:after="100" w:afterAutospacing="1" w:line="240" w:lineRule="auto"/>
+        <w:rPr>
+          <w:rFonts w:ascii="Times New Roman" w:eastAsia="Times New Roman" w:hAnsi="Times New Roman" w:cs="Times New Roman"/>
+          <w:sz w:val="24"/>
+          <w:szCs w:val="24"/>
+          <w:lang w:eastAsia="en-IN"/>
+        </w:rPr>
+      </w:pPr>
+      <w:r>
+        <w:rPr>
+          <w:rFonts w:ascii="Times New Roman" w:eastAsia="Times New Roman" w:hAnsi="Times New Roman" w:cs="Times New Roman"/>
+          <w:sz w:val="24"/>
+          <w:szCs w:val="24"/>
+          <w:lang w:eastAsia="en-IN"/>
+        </w:rPr>
+        <w:t>Display each Recall Anchor on a separate line.</w:t>
+      </w:r>
+    </w:p>
+    <w:p>
+      <w:pPr>
+        <w:spacing w:before="100" w:beforeAutospacing="1" w:after="100" w:afterAutospacing="1" w:line="240" w:lineRule="auto"/>
         <w:outlineLvl w:val="0"/>
         <w:rPr>
           <w:rFonts w:ascii="Calibri" w:eastAsia="Times New Roman" w:hAnsi="Calibri" w:cs="Calibri"/>
@@ -2522,1573 +3190,8 @@
           <w:lang w:eastAsia="en-IN"/>
         </w:rPr>
       </w:pPr>
-      <w:r>
-        <w:rPr>
-          <w:rFonts w:ascii="Calibri" w:eastAsia="Times New Roman" w:hAnsi="Calibri" w:cs="Calibri"/>
-          <w:bCs/>
-          <w:kern w:val="36"/>
-          <w:sz w:val="24"/>
-          <w:szCs w:val="24"/>
-          <w:lang w:eastAsia="en-IN"/>
-        </w:rPr>
-        <w:t>RECALL ANCHORS</w:t>
-      </w:r>
-    </w:p>
-    <w:p>
-      <w:pPr>
-        <w:spacing w:before="100" w:beforeAutospacing="1" w:after="100" w:afterAutospacing="1" w:line="240" w:lineRule="auto"/>
-        <w:outlineLvl w:val="0"/>
-        <w:rPr>
-          <w:rFonts w:ascii="Calibri" w:eastAsia="Times New Roman" w:hAnsi="Calibri" w:cs="Calibri"/>
-          <w:bCs/>
-          <w:kern w:val="36"/>
-          <w:sz w:val="24"/>
-          <w:szCs w:val="24"/>
-          <w:lang w:eastAsia="en-IN"/>
-        </w:rPr>
-      </w:pPr>
-      <w:r>
-        <w:rPr>
-          <w:rFonts w:ascii="Calibri" w:eastAsia="Times New Roman" w:hAnsi="Calibri" w:cs="Calibri"/>
-          <w:bCs/>
-          <w:kern w:val="36"/>
-          <w:sz w:val="24"/>
-          <w:szCs w:val="24"/>
-          <w:lang w:eastAsia="en-IN"/>
-        </w:rPr>
-        <w:t>Study the editorial thoroughly before answering.</w:t>
-      </w:r>
-    </w:p>
-    <w:p>
-      <w:pPr>
-        <w:spacing w:before="100" w:beforeAutospacing="1" w:after="100" w:afterAutospacing="1" w:line="240" w:lineRule="auto"/>
-        <w:outlineLvl w:val="0"/>
-        <w:rPr>
-          <w:rFonts w:ascii="Calibri" w:eastAsia="Times New Roman" w:hAnsi="Calibri" w:cs="Calibri"/>
-          <w:bCs/>
-          <w:kern w:val="36"/>
-          <w:sz w:val="24"/>
-          <w:szCs w:val="24"/>
-          <w:lang w:eastAsia="en-IN"/>
-        </w:rPr>
-      </w:pPr>
-      <w:r>
-        <w:rPr>
-          <w:rFonts w:ascii="Calibri" w:eastAsia="Times New Roman" w:hAnsi="Calibri" w:cs="Calibri"/>
-          <w:bCs/>
-          <w:kern w:val="36"/>
-          <w:sz w:val="24"/>
-          <w:szCs w:val="24"/>
-          <w:lang w:eastAsia="en-IN"/>
-        </w:rPr>
-        <w:t>Generate exactly five Recall Anchors that together represent the permanent knowledge structure of the issue. The Recall Anchors should collectively support the Knowledge Points, Quick Facts, Mains Answer, and MCQs.</w:t>
-      </w:r>
-    </w:p>
-    <w:p>
-      <w:pPr>
-        <w:spacing w:before="100" w:beforeAutospacing="1" w:after="100" w:afterAutospacing="1" w:line="240" w:lineRule="auto"/>
-        <w:outlineLvl w:val="0"/>
-        <w:rPr>
-          <w:rFonts w:ascii="Calibri" w:eastAsia="Times New Roman" w:hAnsi="Calibri" w:cs="Calibri"/>
-          <w:bCs/>
-          <w:kern w:val="36"/>
-          <w:sz w:val="24"/>
-          <w:szCs w:val="24"/>
-          <w:lang w:eastAsia="en-IN"/>
-        </w:rPr>
-      </w:pPr>
-      <w:r>
-        <w:rPr>
-          <w:rFonts w:ascii="Calibri" w:eastAsia="Times New Roman" w:hAnsi="Calibri" w:cs="Calibri"/>
-          <w:bCs/>
-          <w:kern w:val="36"/>
-          <w:sz w:val="24"/>
-          <w:szCs w:val="24"/>
-          <w:lang w:eastAsia="en-IN"/>
-        </w:rPr>
-        <w:t>Each Recall Anchor should function as a powerful memory trigger that enables students to mentally reconstruct the entire educational page during revision, including the Knowledge Points, Quick Facts, Mains Answer, and MCQs wherever relevant.</w:t>
-      </w:r>
-    </w:p>
-    <w:p>
-      <w:pPr>
-        <w:spacing w:before="100" w:beforeAutospacing="1" w:after="100" w:afterAutospacing="1" w:line="240" w:lineRule="auto"/>
-        <w:outlineLvl w:val="0"/>
-        <w:rPr>
-          <w:rFonts w:ascii="Calibri" w:eastAsia="Times New Roman" w:hAnsi="Calibri" w:cs="Calibri"/>
-          <w:bCs/>
-          <w:kern w:val="36"/>
-          <w:sz w:val="24"/>
-          <w:szCs w:val="24"/>
-          <w:lang w:eastAsia="en-IN"/>
-        </w:rPr>
-      </w:pPr>
-      <w:r>
-        <w:rPr>
-          <w:rFonts w:ascii="Calibri" w:eastAsia="Times New Roman" w:hAnsi="Calibri" w:cs="Calibri"/>
-          <w:bCs/>
-          <w:kern w:val="36"/>
-          <w:sz w:val="24"/>
-          <w:szCs w:val="24"/>
-          <w:lang w:eastAsia="en-IN"/>
-        </w:rPr>
-        <w:t>Prefer anchors such as:</w:t>
-      </w:r>
-    </w:p>
-    <w:p>
-      <w:pPr>
-        <w:spacing w:before="100" w:beforeAutospacing="1" w:after="100" w:afterAutospacing="1" w:line="240" w:lineRule="auto"/>
-        <w:outlineLvl w:val="0"/>
-        <w:rPr>
-          <w:rFonts w:ascii="Calibri" w:eastAsia="Times New Roman" w:hAnsi="Calibri" w:cs="Calibri"/>
-          <w:bCs/>
-          <w:kern w:val="36"/>
-          <w:sz w:val="24"/>
-          <w:szCs w:val="24"/>
-          <w:lang w:eastAsia="en-IN"/>
-        </w:rPr>
-      </w:pPr>
-      <w:r>
-        <w:rPr>
-          <w:rFonts w:ascii="Calibri" w:eastAsia="Times New Roman" w:hAnsi="Calibri" w:cs="Calibri"/>
-          <w:bCs/>
-          <w:kern w:val="36"/>
-          <w:sz w:val="24"/>
-          <w:szCs w:val="24"/>
-          <w:lang w:eastAsia="en-IN"/>
-        </w:rPr>
-        <w:t>• Constitutional Articles</w:t>
-      </w:r>
-    </w:p>
-    <w:p>
-      <w:pPr>
-        <w:spacing w:before="100" w:beforeAutospacing="1" w:after="100" w:afterAutospacing="1" w:line="240" w:lineRule="auto"/>
-        <w:outlineLvl w:val="0"/>
-        <w:rPr>
-          <w:rFonts w:ascii="Calibri" w:eastAsia="Times New Roman" w:hAnsi="Calibri" w:cs="Calibri"/>
-          <w:bCs/>
-          <w:kern w:val="36"/>
-          <w:sz w:val="24"/>
-          <w:szCs w:val="24"/>
-          <w:lang w:eastAsia="en-IN"/>
-        </w:rPr>
-      </w:pPr>
-      <w:r>
-        <w:rPr>
-          <w:rFonts w:ascii="Calibri" w:eastAsia="Times New Roman" w:hAnsi="Calibri" w:cs="Calibri"/>
-          <w:bCs/>
-          <w:kern w:val="36"/>
-          <w:sz w:val="24"/>
-          <w:szCs w:val="24"/>
-          <w:lang w:eastAsia="en-IN"/>
-        </w:rPr>
-        <w:t>• Acts</w:t>
-      </w:r>
-    </w:p>
-    <w:p>
-      <w:pPr>
-        <w:spacing w:before="100" w:beforeAutospacing="1" w:after="100" w:afterAutospacing="1" w:line="240" w:lineRule="auto"/>
-        <w:outlineLvl w:val="0"/>
-        <w:rPr>
-          <w:rFonts w:ascii="Calibri" w:eastAsia="Times New Roman" w:hAnsi="Calibri" w:cs="Calibri"/>
-          <w:bCs/>
-          <w:kern w:val="36"/>
-          <w:sz w:val="24"/>
-          <w:szCs w:val="24"/>
-          <w:lang w:eastAsia="en-IN"/>
-        </w:rPr>
-      </w:pPr>
-      <w:r>
-        <w:rPr>
-          <w:rFonts w:ascii="Calibri" w:eastAsia="Times New Roman" w:hAnsi="Calibri" w:cs="Calibri"/>
-          <w:bCs/>
-          <w:kern w:val="36"/>
-          <w:sz w:val="24"/>
-          <w:szCs w:val="24"/>
-          <w:lang w:eastAsia="en-IN"/>
-        </w:rPr>
-        <w:t>• Rules</w:t>
-      </w:r>
-    </w:p>
-    <w:p>
-      <w:pPr>
-        <w:spacing w:before="100" w:beforeAutospacing="1" w:after="100" w:afterAutospacing="1" w:line="240" w:lineRule="auto"/>
-        <w:outlineLvl w:val="0"/>
-        <w:rPr>
-          <w:rFonts w:ascii="Calibri" w:eastAsia="Times New Roman" w:hAnsi="Calibri" w:cs="Calibri"/>
-          <w:bCs/>
-          <w:kern w:val="36"/>
-          <w:sz w:val="24"/>
-          <w:szCs w:val="24"/>
-          <w:lang w:eastAsia="en-IN"/>
-        </w:rPr>
-      </w:pPr>
-      <w:r>
-        <w:rPr>
-          <w:rFonts w:ascii="Calibri" w:eastAsia="Times New Roman" w:hAnsi="Calibri" w:cs="Calibri"/>
-          <w:bCs/>
-          <w:kern w:val="36"/>
-          <w:sz w:val="24"/>
-          <w:szCs w:val="24"/>
-          <w:lang w:eastAsia="en-IN"/>
-        </w:rPr>
-        <w:t>• Committees</w:t>
-      </w:r>
-    </w:p>
-    <w:p>
-      <w:pPr>
-        <w:spacing w:before="100" w:beforeAutospacing="1" w:after="100" w:afterAutospacing="1" w:line="240" w:lineRule="auto"/>
-        <w:outlineLvl w:val="0"/>
-        <w:rPr>
-          <w:rFonts w:ascii="Calibri" w:eastAsia="Times New Roman" w:hAnsi="Calibri" w:cs="Calibri"/>
-          <w:bCs/>
-          <w:kern w:val="36"/>
-          <w:sz w:val="24"/>
-          <w:szCs w:val="24"/>
-          <w:lang w:eastAsia="en-IN"/>
-        </w:rPr>
-      </w:pPr>
-      <w:r>
-        <w:rPr>
-          <w:rFonts w:ascii="Calibri" w:eastAsia="Times New Roman" w:hAnsi="Calibri" w:cs="Calibri"/>
-          <w:bCs/>
-          <w:kern w:val="36"/>
-          <w:sz w:val="24"/>
-          <w:szCs w:val="24"/>
-          <w:lang w:eastAsia="en-IN"/>
-        </w:rPr>
-        <w:t>• Commissions</w:t>
-      </w:r>
-    </w:p>
-    <w:p>
-      <w:pPr>
-        <w:spacing w:before="100" w:beforeAutospacing="1" w:after="100" w:afterAutospacing="1" w:line="240" w:lineRule="auto"/>
-        <w:outlineLvl w:val="0"/>
-        <w:rPr>
-          <w:rFonts w:ascii="Calibri" w:eastAsia="Times New Roman" w:hAnsi="Calibri" w:cs="Calibri"/>
-          <w:bCs/>
-          <w:kern w:val="36"/>
-          <w:sz w:val="24"/>
-          <w:szCs w:val="24"/>
-          <w:lang w:eastAsia="en-IN"/>
-        </w:rPr>
-      </w:pPr>
-      <w:r>
-        <w:rPr>
-          <w:rFonts w:ascii="Calibri" w:eastAsia="Times New Roman" w:hAnsi="Calibri" w:cs="Calibri"/>
-          <w:bCs/>
-          <w:kern w:val="36"/>
-          <w:sz w:val="24"/>
-          <w:szCs w:val="24"/>
-          <w:lang w:eastAsia="en-IN"/>
-        </w:rPr>
-        <w:t>• Supreme Court Judgments</w:t>
-      </w:r>
-    </w:p>
-    <w:p>
-      <w:pPr>
-        <w:spacing w:before="100" w:beforeAutospacing="1" w:after="100" w:afterAutospacing="1" w:line="240" w:lineRule="auto"/>
-        <w:outlineLvl w:val="0"/>
-        <w:rPr>
-          <w:rFonts w:ascii="Calibri" w:eastAsia="Times New Roman" w:hAnsi="Calibri" w:cs="Calibri"/>
-          <w:bCs/>
-          <w:kern w:val="36"/>
-          <w:sz w:val="24"/>
-          <w:szCs w:val="24"/>
-          <w:lang w:eastAsia="en-IN"/>
-        </w:rPr>
-      </w:pPr>
-      <w:r>
-        <w:rPr>
-          <w:rFonts w:ascii="Calibri" w:eastAsia="Times New Roman" w:hAnsi="Calibri" w:cs="Calibri"/>
-          <w:bCs/>
-          <w:kern w:val="36"/>
-          <w:sz w:val="24"/>
-          <w:szCs w:val="24"/>
-          <w:lang w:eastAsia="en-IN"/>
-        </w:rPr>
-        <w:t>• Institutions</w:t>
-      </w:r>
-    </w:p>
-    <w:p>
-      <w:pPr>
-        <w:spacing w:before="100" w:beforeAutospacing="1" w:after="100" w:afterAutospacing="1" w:line="240" w:lineRule="auto"/>
-        <w:outlineLvl w:val="0"/>
-        <w:rPr>
-          <w:rFonts w:ascii="Calibri" w:eastAsia="Times New Roman" w:hAnsi="Calibri" w:cs="Calibri"/>
-          <w:bCs/>
-          <w:kern w:val="36"/>
-          <w:sz w:val="24"/>
-          <w:szCs w:val="24"/>
-          <w:lang w:eastAsia="en-IN"/>
-        </w:rPr>
-      </w:pPr>
-      <w:r>
-        <w:rPr>
-          <w:rFonts w:ascii="Calibri" w:eastAsia="Times New Roman" w:hAnsi="Calibri" w:cs="Calibri"/>
-          <w:bCs/>
-          <w:kern w:val="36"/>
-          <w:sz w:val="24"/>
-          <w:szCs w:val="24"/>
-          <w:lang w:eastAsia="en-IN"/>
-        </w:rPr>
-        <w:t>• Government Schemes</w:t>
-      </w:r>
-    </w:p>
-    <w:p>
-      <w:pPr>
-        <w:spacing w:before="100" w:beforeAutospacing="1" w:after="100" w:afterAutospacing="1" w:line="240" w:lineRule="auto"/>
-        <w:outlineLvl w:val="0"/>
-        <w:rPr>
-          <w:rFonts w:ascii="Calibri" w:eastAsia="Times New Roman" w:hAnsi="Calibri" w:cs="Calibri"/>
-          <w:bCs/>
-          <w:kern w:val="36"/>
-          <w:sz w:val="24"/>
-          <w:szCs w:val="24"/>
-          <w:lang w:eastAsia="en-IN"/>
-        </w:rPr>
-      </w:pPr>
-      <w:r>
-        <w:rPr>
-          <w:rFonts w:ascii="Calibri" w:eastAsia="Times New Roman" w:hAnsi="Calibri" w:cs="Calibri"/>
-          <w:bCs/>
-          <w:kern w:val="36"/>
-          <w:sz w:val="24"/>
-          <w:szCs w:val="24"/>
-          <w:lang w:eastAsia="en-IN"/>
-        </w:rPr>
-        <w:t>• Reports</w:t>
-      </w:r>
-    </w:p>
-    <w:p>
-      <w:pPr>
-        <w:spacing w:before="100" w:beforeAutospacing="1" w:after="100" w:afterAutospacing="1" w:line="240" w:lineRule="auto"/>
-        <w:outlineLvl w:val="0"/>
-        <w:rPr>
-          <w:rFonts w:ascii="Calibri" w:eastAsia="Times New Roman" w:hAnsi="Calibri" w:cs="Calibri"/>
-          <w:bCs/>
-          <w:kern w:val="36"/>
-          <w:sz w:val="24"/>
-          <w:szCs w:val="24"/>
-          <w:lang w:eastAsia="en-IN"/>
-        </w:rPr>
-      </w:pPr>
-      <w:r>
-        <w:rPr>
-          <w:rFonts w:ascii="Calibri" w:eastAsia="Times New Roman" w:hAnsi="Calibri" w:cs="Calibri"/>
-          <w:bCs/>
-          <w:kern w:val="36"/>
-          <w:sz w:val="24"/>
-          <w:szCs w:val="24"/>
-          <w:lang w:eastAsia="en-IN"/>
-        </w:rPr>
-        <w:t>• International Organisations</w:t>
-      </w:r>
-    </w:p>
-    <w:p>
-      <w:pPr>
-        <w:spacing w:before="100" w:beforeAutospacing="1" w:after="100" w:afterAutospacing="1" w:line="240" w:lineRule="auto"/>
-        <w:outlineLvl w:val="0"/>
-        <w:rPr>
-          <w:rFonts w:ascii="Calibri" w:eastAsia="Times New Roman" w:hAnsi="Calibri" w:cs="Calibri"/>
-          <w:bCs/>
-          <w:kern w:val="36"/>
-          <w:sz w:val="24"/>
-          <w:szCs w:val="24"/>
-          <w:lang w:eastAsia="en-IN"/>
-        </w:rPr>
-      </w:pPr>
-      <w:r>
-        <w:rPr>
-          <w:rFonts w:ascii="Calibri" w:eastAsia="Times New Roman" w:hAnsi="Calibri" w:cs="Calibri"/>
-          <w:bCs/>
-          <w:kern w:val="36"/>
-          <w:sz w:val="24"/>
-          <w:szCs w:val="24"/>
-          <w:lang w:eastAsia="en-IN"/>
-        </w:rPr>
-        <w:t>• Scientific Concepts</w:t>
-      </w:r>
-    </w:p>
-    <w:p>
-      <w:pPr>
-        <w:spacing w:before="100" w:beforeAutospacing="1" w:after="100" w:afterAutospacing="1" w:line="240" w:lineRule="auto"/>
-        <w:outlineLvl w:val="0"/>
-        <w:rPr>
-          <w:rFonts w:ascii="Calibri" w:eastAsia="Times New Roman" w:hAnsi="Calibri" w:cs="Calibri"/>
-          <w:bCs/>
-          <w:kern w:val="36"/>
-          <w:sz w:val="24"/>
-          <w:szCs w:val="24"/>
-          <w:lang w:eastAsia="en-IN"/>
-        </w:rPr>
-      </w:pPr>
-      <w:r>
-        <w:rPr>
-          <w:rFonts w:ascii="Calibri" w:eastAsia="Times New Roman" w:hAnsi="Calibri" w:cs="Calibri"/>
-          <w:bCs/>
-          <w:kern w:val="36"/>
-          <w:sz w:val="24"/>
-          <w:szCs w:val="24"/>
-          <w:lang w:eastAsia="en-IN"/>
-        </w:rPr>
-        <w:t>• Economic Concepts</w:t>
-      </w:r>
-    </w:p>
-    <w:p>
-      <w:pPr>
-        <w:spacing w:before="100" w:beforeAutospacing="1" w:after="100" w:afterAutospacing="1" w:line="240" w:lineRule="auto"/>
-        <w:outlineLvl w:val="0"/>
-        <w:rPr>
-          <w:rFonts w:ascii="Calibri" w:eastAsia="Times New Roman" w:hAnsi="Calibri" w:cs="Calibri"/>
-          <w:bCs/>
-          <w:kern w:val="36"/>
-          <w:sz w:val="24"/>
-          <w:szCs w:val="24"/>
-          <w:lang w:eastAsia="en-IN"/>
-        </w:rPr>
-      </w:pPr>
-      <w:r>
-        <w:rPr>
-          <w:rFonts w:ascii="Calibri" w:eastAsia="Times New Roman" w:hAnsi="Calibri" w:cs="Calibri"/>
-          <w:bCs/>
-          <w:kern w:val="36"/>
-          <w:sz w:val="24"/>
-          <w:szCs w:val="24"/>
-          <w:lang w:eastAsia="en-IN"/>
-        </w:rPr>
-        <w:t>• Environmental Concepts</w:t>
-      </w:r>
-    </w:p>
-    <w:p>
-      <w:pPr>
-        <w:spacing w:before="100" w:beforeAutospacing="1" w:after="100" w:afterAutospacing="1" w:line="240" w:lineRule="auto"/>
-        <w:outlineLvl w:val="0"/>
-        <w:rPr>
-          <w:rFonts w:ascii="Calibri" w:eastAsia="Times New Roman" w:hAnsi="Calibri" w:cs="Calibri"/>
-          <w:bCs/>
-          <w:kern w:val="36"/>
-          <w:sz w:val="24"/>
-          <w:szCs w:val="24"/>
-          <w:lang w:eastAsia="en-IN"/>
-        </w:rPr>
-      </w:pPr>
-      <w:r>
-        <w:rPr>
-          <w:rFonts w:ascii="Calibri" w:eastAsia="Times New Roman" w:hAnsi="Calibri" w:cs="Calibri"/>
-          <w:bCs/>
-          <w:kern w:val="36"/>
-          <w:sz w:val="24"/>
-          <w:szCs w:val="24"/>
-          <w:lang w:eastAsia="en-IN"/>
-        </w:rPr>
-        <w:t>• Technical Terms</w:t>
-      </w:r>
-    </w:p>
-    <w:p>
-      <w:pPr>
-        <w:spacing w:before="100" w:beforeAutospacing="1" w:after="100" w:afterAutospacing="1" w:line="240" w:lineRule="auto"/>
-        <w:outlineLvl w:val="0"/>
-        <w:rPr>
-          <w:rFonts w:ascii="Calibri" w:eastAsia="Times New Roman" w:hAnsi="Calibri" w:cs="Calibri"/>
-          <w:bCs/>
-          <w:kern w:val="36"/>
-          <w:sz w:val="24"/>
-          <w:szCs w:val="24"/>
-          <w:lang w:eastAsia="en-IN"/>
-        </w:rPr>
-      </w:pPr>
-      <w:r>
-        <w:rPr>
-          <w:rFonts w:ascii="Calibri" w:eastAsia="Times New Roman" w:hAnsi="Calibri" w:cs="Calibri"/>
-          <w:bCs/>
-          <w:kern w:val="36"/>
-          <w:sz w:val="24"/>
-          <w:szCs w:val="24"/>
-          <w:lang w:eastAsia="en-IN"/>
-        </w:rPr>
-        <w:t>• Editorial-specific permanent concepts</w:t>
-      </w:r>
-    </w:p>
-    <w:p>
-      <w:pPr>
-        <w:spacing w:before="100" w:beforeAutospacing="1" w:after="100" w:afterAutospacing="1" w:line="240" w:lineRule="auto"/>
-        <w:outlineLvl w:val="0"/>
-        <w:rPr>
-          <w:rFonts w:ascii="Calibri" w:eastAsia="Times New Roman" w:hAnsi="Calibri" w:cs="Calibri"/>
-          <w:bCs/>
-          <w:kern w:val="36"/>
-          <w:sz w:val="24"/>
-          <w:szCs w:val="24"/>
-          <w:lang w:eastAsia="en-IN"/>
-        </w:rPr>
-      </w:pPr>
-      <w:r>
-        <w:rPr>
-          <w:rFonts w:ascii="Calibri" w:eastAsia="Times New Roman" w:hAnsi="Calibri" w:cs="Calibri"/>
-          <w:bCs/>
-          <w:kern w:val="36"/>
-          <w:sz w:val="24"/>
-          <w:szCs w:val="24"/>
-          <w:lang w:eastAsia="en-IN"/>
-        </w:rPr>
-        <w:lastRenderedPageBreak/>
-        <w:t>Each anchor should normally contain one to three words.</w:t>
-      </w:r>
-    </w:p>
-    <w:p>
-      <w:pPr>
-        <w:spacing w:before="100" w:beforeAutospacing="1" w:after="100" w:afterAutospacing="1" w:line="240" w:lineRule="auto"/>
-        <w:outlineLvl w:val="0"/>
-        <w:rPr>
-          <w:rFonts w:ascii="Calibri" w:eastAsia="Times New Roman" w:hAnsi="Calibri" w:cs="Calibri"/>
-          <w:bCs/>
-          <w:kern w:val="36"/>
-          <w:sz w:val="24"/>
-          <w:szCs w:val="24"/>
-          <w:lang w:eastAsia="en-IN"/>
-        </w:rPr>
-      </w:pPr>
-      <w:r>
-        <w:rPr>
-          <w:rFonts w:ascii="Calibri" w:eastAsia="Times New Roman" w:hAnsi="Calibri" w:cs="Calibri"/>
-          <w:bCs/>
-          <w:kern w:val="36"/>
-          <w:sz w:val="24"/>
-          <w:szCs w:val="24"/>
-          <w:lang w:eastAsia="en-IN"/>
-        </w:rPr>
-        <w:t>Avoid generic expressions such as:</w:t>
-      </w:r>
-    </w:p>
-    <w:p>
-      <w:pPr>
-        <w:spacing w:before="100" w:beforeAutospacing="1" w:after="100" w:afterAutospacing="1" w:line="240" w:lineRule="auto"/>
-        <w:outlineLvl w:val="0"/>
-        <w:rPr>
-          <w:rFonts w:ascii="Calibri" w:eastAsia="Times New Roman" w:hAnsi="Calibri" w:cs="Calibri"/>
-          <w:bCs/>
-          <w:kern w:val="36"/>
-          <w:sz w:val="24"/>
-          <w:szCs w:val="24"/>
-          <w:lang w:eastAsia="en-IN"/>
-        </w:rPr>
-      </w:pPr>
-      <w:r>
-        <w:rPr>
-          <w:rFonts w:ascii="Calibri" w:eastAsia="Times New Roman" w:hAnsi="Calibri" w:cs="Calibri"/>
-          <w:bCs/>
-          <w:kern w:val="36"/>
-          <w:sz w:val="24"/>
-          <w:szCs w:val="24"/>
-          <w:lang w:eastAsia="en-IN"/>
-        </w:rPr>
-        <w:t>• Policy Reform</w:t>
-      </w:r>
-    </w:p>
-    <w:p>
-      <w:pPr>
-        <w:spacing w:before="100" w:beforeAutospacing="1" w:after="100" w:afterAutospacing="1" w:line="240" w:lineRule="auto"/>
-        <w:outlineLvl w:val="0"/>
-        <w:rPr>
-          <w:rFonts w:ascii="Calibri" w:eastAsia="Times New Roman" w:hAnsi="Calibri" w:cs="Calibri"/>
-          <w:bCs/>
-          <w:kern w:val="36"/>
-          <w:sz w:val="24"/>
-          <w:szCs w:val="24"/>
-          <w:lang w:eastAsia="en-IN"/>
-        </w:rPr>
-      </w:pPr>
-      <w:r>
-        <w:rPr>
-          <w:rFonts w:ascii="Calibri" w:eastAsia="Times New Roman" w:hAnsi="Calibri" w:cs="Calibri"/>
-          <w:bCs/>
-          <w:kern w:val="36"/>
-          <w:sz w:val="24"/>
-          <w:szCs w:val="24"/>
-          <w:lang w:eastAsia="en-IN"/>
-        </w:rPr>
-        <w:t>• Implementation</w:t>
-      </w:r>
-    </w:p>
-    <w:p>
-      <w:pPr>
-        <w:spacing w:before="100" w:beforeAutospacing="1" w:after="100" w:afterAutospacing="1" w:line="240" w:lineRule="auto"/>
-        <w:outlineLvl w:val="0"/>
-        <w:rPr>
-          <w:rFonts w:ascii="Calibri" w:eastAsia="Times New Roman" w:hAnsi="Calibri" w:cs="Calibri"/>
-          <w:bCs/>
-          <w:kern w:val="36"/>
-          <w:sz w:val="24"/>
-          <w:szCs w:val="24"/>
-          <w:lang w:eastAsia="en-IN"/>
-        </w:rPr>
-      </w:pPr>
-      <w:r>
-        <w:rPr>
-          <w:rFonts w:ascii="Calibri" w:eastAsia="Times New Roman" w:hAnsi="Calibri" w:cs="Calibri"/>
-          <w:bCs/>
-          <w:kern w:val="36"/>
-          <w:sz w:val="24"/>
-          <w:szCs w:val="24"/>
-          <w:lang w:eastAsia="en-IN"/>
-        </w:rPr>
-        <w:t>• Awareness</w:t>
-      </w:r>
-    </w:p>
-    <w:p>
-      <w:pPr>
-        <w:spacing w:before="100" w:beforeAutospacing="1" w:after="100" w:afterAutospacing="1" w:line="240" w:lineRule="auto"/>
-        <w:outlineLvl w:val="0"/>
-        <w:rPr>
-          <w:rFonts w:ascii="Calibri" w:eastAsia="Times New Roman" w:hAnsi="Calibri" w:cs="Calibri"/>
-          <w:bCs/>
-          <w:kern w:val="36"/>
-          <w:sz w:val="24"/>
-          <w:szCs w:val="24"/>
-          <w:lang w:eastAsia="en-IN"/>
-        </w:rPr>
-      </w:pPr>
-      <w:r>
-        <w:rPr>
-          <w:rFonts w:ascii="Calibri" w:eastAsia="Times New Roman" w:hAnsi="Calibri" w:cs="Calibri"/>
-          <w:bCs/>
-          <w:kern w:val="36"/>
-          <w:sz w:val="24"/>
-          <w:szCs w:val="24"/>
-          <w:lang w:eastAsia="en-IN"/>
-        </w:rPr>
-        <w:t>• Strategy</w:t>
-      </w:r>
-    </w:p>
-    <w:p>
-      <w:pPr>
-        <w:spacing w:before="100" w:beforeAutospacing="1" w:after="100" w:afterAutospacing="1" w:line="240" w:lineRule="auto"/>
-        <w:outlineLvl w:val="0"/>
-        <w:rPr>
-          <w:rFonts w:ascii="Calibri" w:eastAsia="Times New Roman" w:hAnsi="Calibri" w:cs="Calibri"/>
-          <w:bCs/>
-          <w:kern w:val="36"/>
-          <w:sz w:val="24"/>
-          <w:szCs w:val="24"/>
-          <w:lang w:eastAsia="en-IN"/>
-        </w:rPr>
-      </w:pPr>
-      <w:r>
-        <w:rPr>
-          <w:rFonts w:ascii="Calibri" w:eastAsia="Times New Roman" w:hAnsi="Calibri" w:cs="Calibri"/>
-          <w:bCs/>
-          <w:kern w:val="36"/>
-          <w:sz w:val="24"/>
-          <w:szCs w:val="24"/>
-          <w:lang w:eastAsia="en-IN"/>
-        </w:rPr>
-        <w:t>• Measures</w:t>
-      </w:r>
-    </w:p>
-    <w:p>
-      <w:pPr>
-        <w:spacing w:before="100" w:beforeAutospacing="1" w:after="100" w:afterAutospacing="1" w:line="240" w:lineRule="auto"/>
-        <w:outlineLvl w:val="0"/>
-        <w:rPr>
-          <w:rFonts w:ascii="Calibri" w:eastAsia="Times New Roman" w:hAnsi="Calibri" w:cs="Calibri"/>
-          <w:bCs/>
-          <w:kern w:val="36"/>
-          <w:sz w:val="24"/>
-          <w:szCs w:val="24"/>
-          <w:lang w:eastAsia="en-IN"/>
-        </w:rPr>
-      </w:pPr>
-      <w:r>
-        <w:rPr>
-          <w:rFonts w:ascii="Calibri" w:eastAsia="Times New Roman" w:hAnsi="Calibri" w:cs="Calibri"/>
-          <w:bCs/>
-          <w:kern w:val="36"/>
-          <w:sz w:val="24"/>
-          <w:szCs w:val="24"/>
-          <w:lang w:eastAsia="en-IN"/>
-        </w:rPr>
-        <w:t>• Governance</w:t>
-      </w:r>
-    </w:p>
-    <w:p>
-      <w:pPr>
-        <w:spacing w:before="100" w:beforeAutospacing="1" w:after="100" w:afterAutospacing="1" w:line="240" w:lineRule="auto"/>
-        <w:outlineLvl w:val="0"/>
-        <w:rPr>
-          <w:rFonts w:ascii="Calibri" w:eastAsia="Times New Roman" w:hAnsi="Calibri" w:cs="Calibri"/>
-          <w:bCs/>
-          <w:kern w:val="36"/>
-          <w:sz w:val="24"/>
-          <w:szCs w:val="24"/>
-          <w:lang w:eastAsia="en-IN"/>
-        </w:rPr>
-      </w:pPr>
-      <w:r>
-        <w:rPr>
-          <w:rFonts w:ascii="Calibri" w:eastAsia="Times New Roman" w:hAnsi="Calibri" w:cs="Calibri"/>
-          <w:bCs/>
-          <w:kern w:val="36"/>
-          <w:sz w:val="24"/>
-          <w:szCs w:val="24"/>
-          <w:lang w:eastAsia="en-IN"/>
-        </w:rPr>
-        <w:t>• Challenges</w:t>
-      </w:r>
-    </w:p>
-    <w:p>
-      <w:pPr>
-        <w:spacing w:before="100" w:beforeAutospacing="1" w:after="100" w:afterAutospacing="1" w:line="240" w:lineRule="auto"/>
-        <w:outlineLvl w:val="0"/>
-        <w:rPr>
-          <w:rFonts w:ascii="Calibri" w:eastAsia="Times New Roman" w:hAnsi="Calibri" w:cs="Calibri"/>
-          <w:bCs/>
-          <w:kern w:val="36"/>
-          <w:sz w:val="24"/>
-          <w:szCs w:val="24"/>
-          <w:lang w:eastAsia="en-IN"/>
-        </w:rPr>
-      </w:pPr>
-      <w:r>
-        <w:rPr>
-          <w:rFonts w:ascii="Calibri" w:eastAsia="Times New Roman" w:hAnsi="Calibri" w:cs="Calibri"/>
-          <w:bCs/>
-          <w:kern w:val="36"/>
-          <w:sz w:val="24"/>
-          <w:szCs w:val="24"/>
-          <w:lang w:eastAsia="en-IN"/>
-        </w:rPr>
-        <w:t>• Framework</w:t>
-      </w:r>
-    </w:p>
-    <w:p>
-      <w:pPr>
-        <w:spacing w:before="100" w:beforeAutospacing="1" w:after="100" w:afterAutospacing="1" w:line="240" w:lineRule="auto"/>
-        <w:outlineLvl w:val="0"/>
-        <w:rPr>
-          <w:rFonts w:ascii="Calibri" w:eastAsia="Times New Roman" w:hAnsi="Calibri" w:cs="Calibri"/>
-          <w:bCs/>
-          <w:kern w:val="36"/>
-          <w:sz w:val="24"/>
-          <w:szCs w:val="24"/>
-          <w:lang w:eastAsia="en-IN"/>
-        </w:rPr>
-      </w:pPr>
-      <w:r>
-        <w:rPr>
-          <w:rFonts w:ascii="Calibri" w:eastAsia="Times New Roman" w:hAnsi="Calibri" w:cs="Calibri"/>
-          <w:bCs/>
-          <w:kern w:val="36"/>
-          <w:sz w:val="24"/>
-          <w:szCs w:val="24"/>
-          <w:lang w:eastAsia="en-IN"/>
-        </w:rPr>
-        <w:t>• Capacity Building</w:t>
-      </w:r>
-    </w:p>
-    <w:p>
-      <w:pPr>
-        <w:spacing w:before="100" w:beforeAutospacing="1" w:after="100" w:afterAutospacing="1" w:line="240" w:lineRule="auto"/>
-        <w:outlineLvl w:val="0"/>
-        <w:rPr>
-          <w:rFonts w:ascii="Calibri" w:eastAsia="Times New Roman" w:hAnsi="Calibri" w:cs="Calibri"/>
-          <w:bCs/>
-          <w:kern w:val="36"/>
-          <w:sz w:val="24"/>
-          <w:szCs w:val="24"/>
-          <w:lang w:eastAsia="en-IN"/>
-        </w:rPr>
-      </w:pPr>
-      <w:r>
-        <w:rPr>
-          <w:rFonts w:ascii="Calibri" w:eastAsia="Times New Roman" w:hAnsi="Calibri" w:cs="Calibri"/>
-          <w:bCs/>
-          <w:kern w:val="36"/>
-          <w:sz w:val="24"/>
-          <w:szCs w:val="24"/>
-          <w:lang w:eastAsia="en-IN"/>
-        </w:rPr>
-        <w:t>• Institutional Reform</w:t>
-      </w:r>
-    </w:p>
-    <w:p>
-      <w:pPr>
-        <w:spacing w:before="100" w:beforeAutospacing="1" w:after="100" w:afterAutospacing="1" w:line="240" w:lineRule="auto"/>
-        <w:outlineLvl w:val="0"/>
-        <w:rPr>
-          <w:rFonts w:ascii="Calibri" w:eastAsia="Times New Roman" w:hAnsi="Calibri" w:cs="Calibri"/>
-          <w:bCs/>
-          <w:kern w:val="36"/>
-          <w:sz w:val="24"/>
-          <w:szCs w:val="24"/>
-          <w:lang w:eastAsia="en-IN"/>
-        </w:rPr>
-      </w:pPr>
-      <w:proofErr w:type="gramStart"/>
-      <w:r>
-        <w:rPr>
-          <w:rFonts w:ascii="Calibri" w:eastAsia="Times New Roman" w:hAnsi="Calibri" w:cs="Calibri"/>
-          <w:bCs/>
-          <w:kern w:val="36"/>
-          <w:sz w:val="24"/>
-          <w:szCs w:val="24"/>
-          <w:lang w:eastAsia="en-IN"/>
-        </w:rPr>
-        <w:t>unless</w:t>
-      </w:r>
-      <w:proofErr w:type="gramEnd"/>
-      <w:r>
-        <w:rPr>
-          <w:rFonts w:ascii="Calibri" w:eastAsia="Times New Roman" w:hAnsi="Calibri" w:cs="Calibri"/>
-          <w:bCs/>
-          <w:kern w:val="36"/>
-          <w:sz w:val="24"/>
-          <w:szCs w:val="24"/>
-          <w:lang w:eastAsia="en-IN"/>
-        </w:rPr>
-        <w:t xml:space="preserve"> they are the only technically correct educational term.</w:t>
-      </w:r>
-    </w:p>
-    <w:p>
-      <w:pPr>
-        <w:spacing w:before="100" w:beforeAutospacing="1" w:after="100" w:afterAutospacing="1" w:line="240" w:lineRule="auto"/>
-        <w:outlineLvl w:val="0"/>
-        <w:rPr>
-          <w:rFonts w:ascii="Calibri" w:eastAsia="Times New Roman" w:hAnsi="Calibri" w:cs="Calibri"/>
-          <w:bCs/>
-          <w:kern w:val="36"/>
-          <w:sz w:val="24"/>
-          <w:szCs w:val="24"/>
-          <w:lang w:eastAsia="en-IN"/>
-        </w:rPr>
-      </w:pPr>
-      <w:r>
-        <w:rPr>
-          <w:rFonts w:ascii="Calibri" w:eastAsia="Times New Roman" w:hAnsi="Calibri" w:cs="Calibri"/>
-          <w:bCs/>
-          <w:kern w:val="36"/>
-          <w:sz w:val="24"/>
-          <w:szCs w:val="24"/>
-          <w:lang w:eastAsia="en-IN"/>
-        </w:rPr>
-        <w:t>Each Recall Anchor should be:</w:t>
-      </w:r>
-    </w:p>
-    <w:p>
-      <w:pPr>
-        <w:spacing w:before="100" w:beforeAutospacing="1" w:after="100" w:afterAutospacing="1" w:line="240" w:lineRule="auto"/>
-        <w:outlineLvl w:val="0"/>
-        <w:rPr>
-          <w:rFonts w:ascii="Calibri" w:eastAsia="Times New Roman" w:hAnsi="Calibri" w:cs="Calibri"/>
-          <w:bCs/>
-          <w:kern w:val="36"/>
-          <w:sz w:val="24"/>
-          <w:szCs w:val="24"/>
-          <w:lang w:eastAsia="en-IN"/>
-        </w:rPr>
-      </w:pPr>
-      <w:r>
-        <w:rPr>
-          <w:rFonts w:ascii="Calibri" w:eastAsia="Times New Roman" w:hAnsi="Calibri" w:cs="Calibri"/>
-          <w:bCs/>
-          <w:kern w:val="36"/>
-          <w:sz w:val="24"/>
-          <w:szCs w:val="24"/>
-          <w:lang w:eastAsia="en-IN"/>
-        </w:rPr>
-        <w:t>• Distinct</w:t>
-      </w:r>
-    </w:p>
-    <w:p>
-      <w:pPr>
-        <w:spacing w:before="100" w:beforeAutospacing="1" w:after="100" w:afterAutospacing="1" w:line="240" w:lineRule="auto"/>
-        <w:outlineLvl w:val="0"/>
-        <w:rPr>
-          <w:rFonts w:ascii="Calibri" w:eastAsia="Times New Roman" w:hAnsi="Calibri" w:cs="Calibri"/>
-          <w:bCs/>
-          <w:kern w:val="36"/>
-          <w:sz w:val="24"/>
-          <w:szCs w:val="24"/>
-          <w:lang w:eastAsia="en-IN"/>
-        </w:rPr>
-      </w:pPr>
-      <w:r>
-        <w:rPr>
-          <w:rFonts w:ascii="Calibri" w:eastAsia="Times New Roman" w:hAnsi="Calibri" w:cs="Calibri"/>
-          <w:bCs/>
-          <w:kern w:val="36"/>
-          <w:sz w:val="24"/>
-          <w:szCs w:val="24"/>
-          <w:lang w:eastAsia="en-IN"/>
-        </w:rPr>
-        <w:t>• Information-rich</w:t>
-      </w:r>
-    </w:p>
-    <w:p>
-      <w:pPr>
-        <w:spacing w:before="100" w:beforeAutospacing="1" w:after="100" w:afterAutospacing="1" w:line="240" w:lineRule="auto"/>
-        <w:outlineLvl w:val="0"/>
-        <w:rPr>
-          <w:rFonts w:ascii="Calibri" w:eastAsia="Times New Roman" w:hAnsi="Calibri" w:cs="Calibri"/>
-          <w:bCs/>
-          <w:kern w:val="36"/>
-          <w:sz w:val="24"/>
-          <w:szCs w:val="24"/>
-          <w:lang w:eastAsia="en-IN"/>
-        </w:rPr>
-      </w:pPr>
-      <w:r>
-        <w:rPr>
-          <w:rFonts w:ascii="Calibri" w:eastAsia="Times New Roman" w:hAnsi="Calibri" w:cs="Calibri"/>
-          <w:bCs/>
-          <w:kern w:val="36"/>
-          <w:sz w:val="24"/>
-          <w:szCs w:val="24"/>
-          <w:lang w:eastAsia="en-IN"/>
-        </w:rPr>
-        <w:t>• Easy to remember</w:t>
-      </w:r>
-    </w:p>
-    <w:p>
-      <w:pPr>
-        <w:spacing w:before="100" w:beforeAutospacing="1" w:after="100" w:afterAutospacing="1" w:line="240" w:lineRule="auto"/>
-        <w:outlineLvl w:val="0"/>
-        <w:rPr>
-          <w:rFonts w:ascii="Calibri" w:eastAsia="Times New Roman" w:hAnsi="Calibri" w:cs="Calibri"/>
-          <w:bCs/>
-          <w:kern w:val="36"/>
-          <w:sz w:val="24"/>
-          <w:szCs w:val="24"/>
-          <w:lang w:eastAsia="en-IN"/>
-        </w:rPr>
-      </w:pPr>
-      <w:r>
-        <w:rPr>
-          <w:rFonts w:ascii="Calibri" w:eastAsia="Times New Roman" w:hAnsi="Calibri" w:cs="Calibri"/>
-          <w:bCs/>
-          <w:kern w:val="36"/>
-          <w:sz w:val="24"/>
-          <w:szCs w:val="24"/>
-          <w:lang w:eastAsia="en-IN"/>
-        </w:rPr>
-        <w:t>• Educationally permanent</w:t>
-      </w:r>
-    </w:p>
-    <w:p>
-      <w:pPr>
-        <w:spacing w:before="100" w:beforeAutospacing="1" w:after="100" w:afterAutospacing="1" w:line="240" w:lineRule="auto"/>
-        <w:outlineLvl w:val="0"/>
-        <w:rPr>
-          <w:rFonts w:ascii="Calibri" w:eastAsia="Times New Roman" w:hAnsi="Calibri" w:cs="Calibri"/>
-          <w:bCs/>
-          <w:kern w:val="36"/>
-          <w:sz w:val="24"/>
-          <w:szCs w:val="24"/>
-          <w:lang w:eastAsia="en-IN"/>
-        </w:rPr>
-      </w:pPr>
-      <w:r>
-        <w:rPr>
-          <w:rFonts w:ascii="Calibri" w:eastAsia="Times New Roman" w:hAnsi="Calibri" w:cs="Calibri"/>
-          <w:bCs/>
-          <w:kern w:val="36"/>
-          <w:sz w:val="24"/>
-          <w:szCs w:val="24"/>
-          <w:lang w:eastAsia="en-IN"/>
-        </w:rPr>
-        <w:t>• Directly useful for active recall</w:t>
-      </w:r>
-    </w:p>
-    <w:p>
-      <w:pPr>
-        <w:spacing w:before="100" w:beforeAutospacing="1" w:after="100" w:afterAutospacing="1" w:line="240" w:lineRule="auto"/>
-        <w:outlineLvl w:val="0"/>
-        <w:rPr>
-          <w:rFonts w:ascii="Calibri" w:eastAsia="Times New Roman" w:hAnsi="Calibri" w:cs="Calibri"/>
-          <w:bCs/>
-          <w:kern w:val="36"/>
-          <w:sz w:val="24"/>
-          <w:szCs w:val="24"/>
-          <w:lang w:eastAsia="en-IN"/>
-        </w:rPr>
-      </w:pPr>
-      <w:r>
-        <w:rPr>
-          <w:rFonts w:ascii="Calibri" w:eastAsia="Times New Roman" w:hAnsi="Calibri" w:cs="Calibri"/>
-          <w:bCs/>
-          <w:kern w:val="36"/>
-          <w:sz w:val="24"/>
-          <w:szCs w:val="24"/>
-          <w:lang w:eastAsia="en-IN"/>
-        </w:rPr>
-        <w:t>Together, the five Recall Anchors should enable a student to reconstruct almost the entire educational discussion.</w:t>
-      </w:r>
-    </w:p>
-    <w:p>
-      <w:pPr>
-        <w:spacing w:before="100" w:beforeAutospacing="1" w:after="100" w:afterAutospacing="1" w:line="240" w:lineRule="auto"/>
-        <w:outlineLvl w:val="0"/>
-        <w:rPr>
-          <w:rFonts w:ascii="Calibri" w:eastAsia="Times New Roman" w:hAnsi="Calibri" w:cs="Calibri"/>
-          <w:bCs/>
-          <w:kern w:val="36"/>
-          <w:sz w:val="24"/>
-          <w:szCs w:val="24"/>
-          <w:lang w:eastAsia="en-IN"/>
-        </w:rPr>
-      </w:pPr>
-      <w:r>
-        <w:rPr>
-          <w:rFonts w:ascii="Calibri" w:eastAsia="Times New Roman" w:hAnsi="Calibri" w:cs="Calibri"/>
-          <w:bCs/>
-          <w:kern w:val="36"/>
-          <w:sz w:val="24"/>
-          <w:szCs w:val="24"/>
-          <w:lang w:eastAsia="en-IN"/>
-        </w:rPr>
-        <w:t>Every Recall Anchor must be meaningfully used at least once elsewhere on the page through one or more of the following sections:</w:t>
-      </w:r>
-    </w:p>
-    <w:p>
-      <w:pPr>
-        <w:spacing w:before="100" w:beforeAutospacing="1" w:after="100" w:afterAutospacing="1" w:line="240" w:lineRule="auto"/>
-        <w:outlineLvl w:val="0"/>
-        <w:rPr>
-          <w:rFonts w:ascii="Calibri" w:eastAsia="Times New Roman" w:hAnsi="Calibri" w:cs="Calibri"/>
-          <w:bCs/>
-          <w:kern w:val="36"/>
-          <w:sz w:val="24"/>
-          <w:szCs w:val="24"/>
-          <w:lang w:eastAsia="en-IN"/>
-        </w:rPr>
-      </w:pPr>
-      <w:r>
-        <w:rPr>
-          <w:rFonts w:ascii="Calibri" w:eastAsia="Times New Roman" w:hAnsi="Calibri" w:cs="Calibri"/>
-          <w:bCs/>
-          <w:kern w:val="36"/>
-          <w:sz w:val="24"/>
-          <w:szCs w:val="24"/>
-          <w:lang w:eastAsia="en-IN"/>
-        </w:rPr>
-        <w:t>• Knowledge Points</w:t>
-      </w:r>
-    </w:p>
-    <w:p>
-      <w:pPr>
-        <w:spacing w:before="100" w:beforeAutospacing="1" w:after="100" w:afterAutospacing="1" w:line="240" w:lineRule="auto"/>
-        <w:outlineLvl w:val="0"/>
-        <w:rPr>
-          <w:rFonts w:ascii="Calibri" w:eastAsia="Times New Roman" w:hAnsi="Calibri" w:cs="Calibri"/>
-          <w:bCs/>
-          <w:kern w:val="36"/>
-          <w:sz w:val="24"/>
-          <w:szCs w:val="24"/>
-          <w:lang w:eastAsia="en-IN"/>
-        </w:rPr>
-      </w:pPr>
-      <w:r>
-        <w:rPr>
-          <w:rFonts w:ascii="Calibri" w:eastAsia="Times New Roman" w:hAnsi="Calibri" w:cs="Calibri"/>
-          <w:bCs/>
-          <w:kern w:val="36"/>
-          <w:sz w:val="24"/>
-          <w:szCs w:val="24"/>
-          <w:lang w:eastAsia="en-IN"/>
-        </w:rPr>
-        <w:t>• Quick Facts</w:t>
-      </w:r>
-    </w:p>
-    <w:p>
-      <w:pPr>
-        <w:spacing w:before="100" w:beforeAutospacing="1" w:after="100" w:afterAutospacing="1" w:line="240" w:lineRule="auto"/>
-        <w:outlineLvl w:val="0"/>
-        <w:rPr>
-          <w:rFonts w:ascii="Calibri" w:eastAsia="Times New Roman" w:hAnsi="Calibri" w:cs="Calibri"/>
-          <w:bCs/>
-          <w:kern w:val="36"/>
-          <w:sz w:val="24"/>
-          <w:szCs w:val="24"/>
-          <w:lang w:eastAsia="en-IN"/>
-        </w:rPr>
-      </w:pPr>
-      <w:r>
-        <w:rPr>
-          <w:rFonts w:ascii="Calibri" w:eastAsia="Times New Roman" w:hAnsi="Calibri" w:cs="Calibri"/>
-          <w:bCs/>
-          <w:kern w:val="36"/>
-          <w:sz w:val="24"/>
-          <w:szCs w:val="24"/>
-          <w:lang w:eastAsia="en-IN"/>
-        </w:rPr>
-        <w:lastRenderedPageBreak/>
-        <w:t>• Mains Answer</w:t>
-      </w:r>
-    </w:p>
-    <w:p>
-      <w:pPr>
-        <w:spacing w:before="100" w:beforeAutospacing="1" w:after="100" w:afterAutospacing="1" w:line="240" w:lineRule="auto"/>
-        <w:outlineLvl w:val="0"/>
-        <w:rPr>
-          <w:rFonts w:ascii="Calibri" w:eastAsia="Times New Roman" w:hAnsi="Calibri" w:cs="Calibri"/>
-          <w:bCs/>
-          <w:kern w:val="36"/>
-          <w:sz w:val="24"/>
-          <w:szCs w:val="24"/>
-          <w:lang w:eastAsia="en-IN"/>
-        </w:rPr>
-      </w:pPr>
-      <w:r>
-        <w:rPr>
-          <w:rFonts w:ascii="Calibri" w:eastAsia="Times New Roman" w:hAnsi="Calibri" w:cs="Calibri"/>
-          <w:bCs/>
-          <w:kern w:val="36"/>
-          <w:sz w:val="24"/>
-          <w:szCs w:val="24"/>
-          <w:lang w:eastAsia="en-IN"/>
-        </w:rPr>
-        <w:t>• MCQs</w:t>
-      </w:r>
-    </w:p>
-    <w:p>
-      <w:pPr>
-        <w:spacing w:before="100" w:beforeAutospacing="1" w:after="100" w:afterAutospacing="1" w:line="240" w:lineRule="auto"/>
-        <w:outlineLvl w:val="0"/>
-        <w:rPr>
-          <w:rFonts w:ascii="Calibri" w:eastAsia="Times New Roman" w:hAnsi="Calibri" w:cs="Calibri"/>
-          <w:bCs/>
-          <w:kern w:val="36"/>
-          <w:sz w:val="24"/>
-          <w:szCs w:val="24"/>
-          <w:lang w:eastAsia="en-IN"/>
-        </w:rPr>
-      </w:pPr>
-      <w:r>
-        <w:rPr>
-          <w:rFonts w:ascii="Calibri" w:eastAsia="Times New Roman" w:hAnsi="Calibri" w:cs="Calibri"/>
-          <w:bCs/>
-          <w:kern w:val="36"/>
-          <w:sz w:val="24"/>
-          <w:szCs w:val="24"/>
-          <w:lang w:eastAsia="en-IN"/>
-        </w:rPr>
-        <w:t>No Recall Anchor should exist solely as an isolated keyword. Each should contribute to explaining, supporting, or testing the issue.</w:t>
-      </w:r>
-    </w:p>
-    <w:p>
-      <w:pPr>
-        <w:spacing w:before="100" w:beforeAutospacing="1" w:after="100" w:afterAutospacing="1" w:line="240" w:lineRule="auto"/>
-        <w:outlineLvl w:val="0"/>
-        <w:rPr>
-          <w:rFonts w:ascii="Calibri" w:eastAsia="Times New Roman" w:hAnsi="Calibri" w:cs="Calibri"/>
-          <w:bCs/>
-          <w:kern w:val="36"/>
-          <w:sz w:val="24"/>
-          <w:szCs w:val="24"/>
-          <w:lang w:eastAsia="en-IN"/>
-        </w:rPr>
-      </w:pPr>
-      <w:r>
-        <w:rPr>
-          <w:rFonts w:ascii="Calibri" w:eastAsia="Times New Roman" w:hAnsi="Calibri" w:cs="Calibri"/>
-          <w:bCs/>
-          <w:kern w:val="36"/>
-          <w:sz w:val="24"/>
-          <w:szCs w:val="24"/>
-          <w:lang w:eastAsia="en-IN"/>
-        </w:rPr>
-        <w:t>Collectively, the five Recall Anchors should enable a student to reconstruct the conceptual explanation, factual evidence, and exam application of the issue.</w:t>
-      </w:r>
-    </w:p>
-    <w:p>
-      <w:pPr>
-        <w:spacing w:before="100" w:beforeAutospacing="1" w:after="100" w:afterAutospacing="1" w:line="240" w:lineRule="auto"/>
-        <w:outlineLvl w:val="0"/>
-        <w:rPr>
-          <w:rFonts w:ascii="Calibri" w:eastAsia="Times New Roman" w:hAnsi="Calibri" w:cs="Calibri"/>
-          <w:bCs/>
-          <w:kern w:val="36"/>
-          <w:sz w:val="24"/>
-          <w:szCs w:val="24"/>
-          <w:lang w:eastAsia="en-IN"/>
-        </w:rPr>
-      </w:pPr>
-      <w:r>
-        <w:rPr>
-          <w:rFonts w:ascii="Calibri" w:eastAsia="Times New Roman" w:hAnsi="Calibri" w:cs="Calibri"/>
-          <w:bCs/>
-          <w:kern w:val="36"/>
-          <w:sz w:val="24"/>
-          <w:szCs w:val="24"/>
-          <w:lang w:eastAsia="en-IN"/>
-        </w:rPr>
-        <w:t xml:space="preserve">If any </w:t>
-      </w:r>
-      <w:proofErr w:type="gramStart"/>
-      <w:r>
-        <w:rPr>
-          <w:rFonts w:ascii="Calibri" w:eastAsia="Times New Roman" w:hAnsi="Calibri" w:cs="Calibri"/>
-          <w:bCs/>
-          <w:kern w:val="36"/>
-          <w:sz w:val="24"/>
-          <w:szCs w:val="24"/>
-          <w:lang w:eastAsia="en-IN"/>
-        </w:rPr>
-        <w:t>Recall</w:t>
-      </w:r>
-      <w:proofErr w:type="gramEnd"/>
-      <w:r>
-        <w:rPr>
-          <w:rFonts w:ascii="Calibri" w:eastAsia="Times New Roman" w:hAnsi="Calibri" w:cs="Calibri"/>
-          <w:bCs/>
-          <w:kern w:val="36"/>
-          <w:sz w:val="24"/>
-          <w:szCs w:val="24"/>
-          <w:lang w:eastAsia="en-IN"/>
-        </w:rPr>
-        <w:t xml:space="preserve"> Anchor is generic, repetitive, low-information, difficult to recall, or does not contribute meaningfully to the overall educational page, silently regenerate it before producing the final output.</w:t>
-      </w:r>
-    </w:p>
-    <w:p>
-      <w:pPr>
-        <w:spacing w:before="100" w:beforeAutospacing="1" w:after="100" w:afterAutospacing="1" w:line="240" w:lineRule="auto"/>
-        <w:outlineLvl w:val="0"/>
-        <w:rPr>
-          <w:rFonts w:ascii="Calibri" w:eastAsia="Times New Roman" w:hAnsi="Calibri" w:cs="Calibri"/>
-          <w:bCs/>
-          <w:kern w:val="36"/>
-          <w:sz w:val="24"/>
-          <w:szCs w:val="24"/>
-          <w:lang w:eastAsia="en-IN"/>
-        </w:rPr>
-      </w:pPr>
-      <w:r>
-        <w:rPr>
-          <w:rFonts w:ascii="Calibri" w:eastAsia="Times New Roman" w:hAnsi="Calibri" w:cs="Calibri"/>
-          <w:bCs/>
-          <w:kern w:val="36"/>
-          <w:sz w:val="24"/>
-          <w:szCs w:val="24"/>
-          <w:lang w:eastAsia="en-IN"/>
-        </w:rPr>
-        <w:t>Produce only the final validated five Recall Anchors.</w:t>
-      </w:r>
-    </w:p>
-    <w:p>
-      <w:pPr>
-        <w:spacing w:before="100" w:beforeAutospacing="1" w:after="100" w:afterAutospacing="1" w:line="240" w:lineRule="auto"/>
-        <w:outlineLvl w:val="0"/>
-        <w:rPr>
-          <w:rFonts w:ascii="Calibri" w:eastAsia="Times New Roman" w:hAnsi="Calibri" w:cs="Calibri"/>
-          <w:bCs/>
-          <w:kern w:val="36"/>
-          <w:sz w:val="24"/>
-          <w:szCs w:val="24"/>
-          <w:lang w:eastAsia="en-IN"/>
-        </w:rPr>
-      </w:pPr>
-      <w:r>
-        <w:rPr>
-          <w:rFonts w:ascii="Calibri" w:eastAsia="Times New Roman" w:hAnsi="Calibri" w:cs="Calibri"/>
-          <w:bCs/>
-          <w:kern w:val="36"/>
-          <w:sz w:val="24"/>
-          <w:szCs w:val="24"/>
-          <w:lang w:eastAsia="en-IN"/>
-        </w:rPr>
-        <w:t>Display each Recall Anchor on a separate line.</w:t>
-      </w:r>
-    </w:p>
-    <w:p>
-      <w:pPr>
-        <w:spacing w:before="100" w:beforeAutospacing="1" w:after="100" w:afterAutospacing="1" w:line="240" w:lineRule="auto"/>
-        <w:outlineLvl w:val="0"/>
-        <w:rPr>
-          <w:rFonts w:ascii="Calibri" w:eastAsia="Times New Roman" w:hAnsi="Calibri" w:cs="Calibri"/>
-          <w:bCs/>
-          <w:kern w:val="36"/>
-          <w:sz w:val="24"/>
-          <w:szCs w:val="24"/>
-          <w:lang w:eastAsia="en-IN"/>
-        </w:rPr>
-      </w:pPr>
-      <w:r>
-        <w:rPr>
-          <w:rFonts w:ascii="Calibri" w:eastAsia="Times New Roman" w:hAnsi="Calibri" w:cs="Calibri"/>
-          <w:bCs/>
-          <w:kern w:val="36"/>
-          <w:sz w:val="24"/>
-          <w:szCs w:val="24"/>
-          <w:lang w:eastAsia="en-IN"/>
-        </w:rPr>
-        <w:t>Before producing the final output, verify that:</w:t>
-      </w:r>
-    </w:p>
-    <w:p>
-      <w:pPr>
-        <w:spacing w:before="100" w:beforeAutospacing="1" w:after="100" w:afterAutospacing="1" w:line="240" w:lineRule="auto"/>
-        <w:outlineLvl w:val="0"/>
-        <w:rPr>
-          <w:rFonts w:ascii="Calibri" w:eastAsia="Times New Roman" w:hAnsi="Calibri" w:cs="Calibri"/>
-          <w:bCs/>
-          <w:kern w:val="36"/>
-          <w:sz w:val="24"/>
-          <w:szCs w:val="24"/>
-          <w:lang w:eastAsia="en-IN"/>
-        </w:rPr>
-      </w:pPr>
-      <w:r>
-        <w:rPr>
-          <w:rFonts w:ascii="MS Gothic" w:eastAsia="MS Gothic" w:hAnsi="MS Gothic" w:cs="MS Gothic" w:hint="eastAsia"/>
-          <w:bCs/>
-          <w:kern w:val="36"/>
-          <w:sz w:val="24"/>
-          <w:szCs w:val="24"/>
-          <w:lang w:eastAsia="en-IN"/>
-        </w:rPr>
-        <w:t>✓</w:t>
-      </w:r>
-      <w:r>
-        <w:rPr>
-          <w:rFonts w:ascii="Calibri" w:eastAsia="Times New Roman" w:hAnsi="Calibri" w:cs="Calibri"/>
-          <w:bCs/>
-          <w:kern w:val="36"/>
-          <w:sz w:val="24"/>
-          <w:szCs w:val="24"/>
-          <w:lang w:eastAsia="en-IN"/>
-        </w:rPr>
-        <w:t xml:space="preserve"> </w:t>
-      </w:r>
-      <w:proofErr w:type="gramStart"/>
-      <w:r>
-        <w:rPr>
-          <w:rFonts w:ascii="Calibri" w:eastAsia="Times New Roman" w:hAnsi="Calibri" w:cs="Calibri"/>
-          <w:bCs/>
-          <w:kern w:val="36"/>
-          <w:sz w:val="24"/>
-          <w:szCs w:val="24"/>
-          <w:lang w:eastAsia="en-IN"/>
-        </w:rPr>
-        <w:t>There</w:t>
-      </w:r>
-      <w:proofErr w:type="gramEnd"/>
-      <w:r>
-        <w:rPr>
-          <w:rFonts w:ascii="Calibri" w:eastAsia="Times New Roman" w:hAnsi="Calibri" w:cs="Calibri"/>
-          <w:bCs/>
-          <w:kern w:val="36"/>
-          <w:sz w:val="24"/>
-          <w:szCs w:val="24"/>
-          <w:lang w:eastAsia="en-IN"/>
-        </w:rPr>
-        <w:t xml:space="preserve"> are exactly five Recall Anchors.</w:t>
-      </w:r>
-    </w:p>
-    <w:p>
-      <w:pPr>
-        <w:spacing w:before="100" w:beforeAutospacing="1" w:after="100" w:afterAutospacing="1" w:line="240" w:lineRule="auto"/>
-        <w:outlineLvl w:val="0"/>
-        <w:rPr>
-          <w:rFonts w:ascii="Calibri" w:eastAsia="Times New Roman" w:hAnsi="Calibri" w:cs="Calibri"/>
-          <w:bCs/>
-          <w:kern w:val="36"/>
-          <w:sz w:val="24"/>
-          <w:szCs w:val="24"/>
-          <w:lang w:eastAsia="en-IN"/>
-        </w:rPr>
-      </w:pPr>
-      <w:r>
-        <w:rPr>
-          <w:rFonts w:ascii="MS Gothic" w:eastAsia="MS Gothic" w:hAnsi="MS Gothic" w:cs="MS Gothic" w:hint="eastAsia"/>
-          <w:bCs/>
-          <w:kern w:val="36"/>
-          <w:sz w:val="24"/>
-          <w:szCs w:val="24"/>
-          <w:lang w:eastAsia="en-IN"/>
-        </w:rPr>
-        <w:t>✓</w:t>
-      </w:r>
-      <w:r>
-        <w:rPr>
-          <w:rFonts w:ascii="Calibri" w:eastAsia="Times New Roman" w:hAnsi="Calibri" w:cs="Calibri"/>
-          <w:bCs/>
-          <w:kern w:val="36"/>
-          <w:sz w:val="24"/>
-          <w:szCs w:val="24"/>
-          <w:lang w:eastAsia="en-IN"/>
-        </w:rPr>
-        <w:t xml:space="preserve"> Every Recall Anchor is meaningful, permanent, and information-rich.</w:t>
-      </w:r>
-    </w:p>
-    <w:p>
-      <w:pPr>
-        <w:spacing w:before="100" w:beforeAutospacing="1" w:after="100" w:afterAutospacing="1" w:line="240" w:lineRule="auto"/>
-        <w:outlineLvl w:val="0"/>
-        <w:rPr>
-          <w:rFonts w:ascii="Calibri" w:eastAsia="Times New Roman" w:hAnsi="Calibri" w:cs="Calibri"/>
-          <w:bCs/>
-          <w:kern w:val="36"/>
-          <w:sz w:val="24"/>
-          <w:szCs w:val="24"/>
-          <w:lang w:eastAsia="en-IN"/>
-        </w:rPr>
-      </w:pPr>
-      <w:r>
-        <w:rPr>
-          <w:rFonts w:ascii="MS Gothic" w:eastAsia="MS Gothic" w:hAnsi="MS Gothic" w:cs="MS Gothic" w:hint="eastAsia"/>
-          <w:bCs/>
-          <w:kern w:val="36"/>
-          <w:sz w:val="24"/>
-          <w:szCs w:val="24"/>
-          <w:lang w:eastAsia="en-IN"/>
-        </w:rPr>
-        <w:t>✓</w:t>
-      </w:r>
-      <w:r>
-        <w:rPr>
-          <w:rFonts w:ascii="Calibri" w:eastAsia="Times New Roman" w:hAnsi="Calibri" w:cs="Calibri"/>
-          <w:bCs/>
-          <w:kern w:val="36"/>
-          <w:sz w:val="24"/>
-          <w:szCs w:val="24"/>
-          <w:lang w:eastAsia="en-IN"/>
-        </w:rPr>
-        <w:t xml:space="preserve"> Every Recall Anchor is used at least once in the Knowledge Points, Quick Facts, Mains Answer, or MCQs.</w:t>
-      </w:r>
-    </w:p>
-    <w:p>
-      <w:pPr>
-        <w:spacing w:before="100" w:beforeAutospacing="1" w:after="100" w:afterAutospacing="1" w:line="240" w:lineRule="auto"/>
-        <w:outlineLvl w:val="0"/>
-        <w:rPr>
-          <w:rFonts w:ascii="Calibri" w:eastAsia="Times New Roman" w:hAnsi="Calibri" w:cs="Calibri"/>
-          <w:bCs/>
-          <w:kern w:val="36"/>
-          <w:sz w:val="24"/>
-          <w:szCs w:val="24"/>
-          <w:lang w:eastAsia="en-IN"/>
-        </w:rPr>
-      </w:pPr>
-      <w:r>
-        <w:rPr>
-          <w:rFonts w:ascii="MS Gothic" w:eastAsia="MS Gothic" w:hAnsi="MS Gothic" w:cs="MS Gothic" w:hint="eastAsia"/>
-          <w:bCs/>
-          <w:kern w:val="36"/>
-          <w:sz w:val="24"/>
-          <w:szCs w:val="24"/>
-          <w:lang w:eastAsia="en-IN"/>
-        </w:rPr>
-        <w:t>✓</w:t>
-      </w:r>
-      <w:r>
-        <w:rPr>
-          <w:rFonts w:ascii="Calibri" w:eastAsia="Times New Roman" w:hAnsi="Calibri" w:cs="Calibri"/>
-          <w:bCs/>
-          <w:kern w:val="36"/>
-          <w:sz w:val="24"/>
-          <w:szCs w:val="24"/>
-          <w:lang w:eastAsia="en-IN"/>
-        </w:rPr>
-        <w:t xml:space="preserve"> No Recall Anchor exists solely as an isolated keyword.</w:t>
-      </w:r>
-    </w:p>
-    <w:p>
-      <w:pPr>
-        <w:spacing w:before="100" w:beforeAutospacing="1" w:after="100" w:afterAutospacing="1" w:line="240" w:lineRule="auto"/>
-        <w:outlineLvl w:val="0"/>
-        <w:rPr>
-          <w:rFonts w:ascii="Calibri" w:eastAsia="Times New Roman" w:hAnsi="Calibri" w:cs="Calibri"/>
-          <w:bCs/>
-          <w:kern w:val="36"/>
-          <w:sz w:val="24"/>
-          <w:szCs w:val="24"/>
-          <w:lang w:eastAsia="en-IN"/>
-        </w:rPr>
-      </w:pPr>
-      <w:r>
-        <w:rPr>
-          <w:rFonts w:ascii="MS Gothic" w:eastAsia="MS Gothic" w:hAnsi="MS Gothic" w:cs="MS Gothic" w:hint="eastAsia"/>
-          <w:bCs/>
-          <w:kern w:val="36"/>
-          <w:sz w:val="24"/>
-          <w:szCs w:val="24"/>
-          <w:lang w:eastAsia="en-IN"/>
-        </w:rPr>
-        <w:t>✓</w:t>
-      </w:r>
-      <w:r>
-        <w:rPr>
-          <w:rFonts w:ascii="Calibri" w:eastAsia="Times New Roman" w:hAnsi="Calibri" w:cs="Calibri"/>
-          <w:bCs/>
-          <w:kern w:val="36"/>
-          <w:sz w:val="24"/>
-          <w:szCs w:val="24"/>
-          <w:lang w:eastAsia="en-IN"/>
-        </w:rPr>
-        <w:t xml:space="preserve"> </w:t>
-      </w:r>
-      <w:proofErr w:type="gramStart"/>
-      <w:r>
-        <w:rPr>
-          <w:rFonts w:ascii="Calibri" w:eastAsia="Times New Roman" w:hAnsi="Calibri" w:cs="Calibri"/>
-          <w:bCs/>
-          <w:kern w:val="36"/>
-          <w:sz w:val="24"/>
-          <w:szCs w:val="24"/>
-          <w:lang w:eastAsia="en-IN"/>
-        </w:rPr>
-        <w:t>Collectively</w:t>
-      </w:r>
-      <w:proofErr w:type="gramEnd"/>
-      <w:r>
-        <w:rPr>
-          <w:rFonts w:ascii="Calibri" w:eastAsia="Times New Roman" w:hAnsi="Calibri" w:cs="Calibri"/>
-          <w:bCs/>
-          <w:kern w:val="36"/>
-          <w:sz w:val="24"/>
-          <w:szCs w:val="24"/>
-          <w:lang w:eastAsia="en-IN"/>
-        </w:rPr>
-        <w:t>, the five Recall Anchors enable reconstruction of the page's concepts, factual evidence, and exam application.</w:t>
-      </w:r>
-    </w:p>
-    <w:p>
-      <w:pPr>
-        <w:spacing w:before="100" w:beforeAutospacing="1" w:after="100" w:afterAutospacing="1" w:line="240" w:lineRule="auto"/>
-        <w:outlineLvl w:val="0"/>
-        <w:rPr>
-          <w:rFonts w:ascii="Calibri" w:eastAsia="Times New Roman" w:hAnsi="Calibri" w:cs="Calibri"/>
-          <w:bCs/>
-          <w:kern w:val="36"/>
-          <w:sz w:val="24"/>
-          <w:szCs w:val="24"/>
-          <w:lang w:eastAsia="en-IN"/>
-        </w:rPr>
-      </w:pPr>
-      <w:r>
-        <w:rPr>
-          <w:rFonts w:ascii="Calibri" w:eastAsia="Times New Roman" w:hAnsi="Calibri" w:cs="Calibri"/>
-          <w:bCs/>
-          <w:kern w:val="36"/>
-          <w:sz w:val="24"/>
-          <w:szCs w:val="24"/>
-          <w:lang w:eastAsia="en-IN"/>
-        </w:rPr>
-        <w:t>If any condition is not satisfied, regenerate the Recall Anchors before producing the final output.</w:t>
-      </w:r>
-    </w:p>
-    <w:p>
-      <w:pPr>
-        <w:spacing w:before="100" w:beforeAutospacing="1" w:after="100" w:afterAutospacing="1" w:line="240" w:lineRule="auto"/>
-        <w:outlineLvl w:val="0"/>
-        <w:rPr>
-          <w:rFonts w:ascii="Calibri" w:eastAsia="Times New Roman" w:hAnsi="Calibri" w:cs="Calibri"/>
-          <w:bCs/>
-          <w:kern w:val="36"/>
-          <w:sz w:val="24"/>
-          <w:szCs w:val="24"/>
-          <w:lang w:eastAsia="en-IN"/>
-        </w:rPr>
-      </w:pPr>
+      <w:bookmarkStart w:id="0" w:name="_GoBack"/>
+      <w:bookmarkEnd w:id="0"/>
       <w:r>
         <w:rPr>
           <w:rFonts w:ascii="Calibri" w:eastAsia="Times New Roman" w:hAnsi="Calibri" w:cs="Calibri"/>
@@ -4333,19 +3436,7 @@
           <w:szCs w:val="24"/>
           <w:lang w:eastAsia="en-IN"/>
         </w:rPr>
-        <w:lastRenderedPageBreak/>
-        <w:t xml:space="preserve">The heading should act as a mini revision heading rather than a newspaper subheading. Prefer educational concepts, institutions, </w:t>
-      </w:r>
-      <w:bookmarkStart w:id="0" w:name="_GoBack"/>
-      <w:bookmarkEnd w:id="0"/>
-      <w:r>
-        <w:rPr>
-          <w:rFonts w:ascii="Calibri" w:eastAsia="Times New Roman" w:hAnsi="Calibri" w:cs="Calibri"/>
-          <w:sz w:val="24"/>
-          <w:szCs w:val="24"/>
-          <w:lang w:eastAsia="en-IN"/>
-        </w:rPr>
-        <w:t>constitutional principles, legal doctrines, scientific ideas, governance mechanisms, or policy themes.</w:t>
+        <w:t>The heading should act as a mini revision heading rather than a newspaper subheading. Prefer educational concepts, institutions, constitutional principles, legal doctrines, scientific ideas, governance mechanisms, or policy themes.</w:t>
       </w:r>
     </w:p>
     <w:p>
@@ -4723,6 +3814,7 @@
           <w:szCs w:val="24"/>
           <w:lang w:eastAsia="en-IN"/>
         </w:rPr>
+        <w:lastRenderedPageBreak/>
         <w:t xml:space="preserve">Long background discussions </w:t>
       </w:r>
     </w:p>
@@ -4838,16 +3930,7 @@
           <w:sz w:val="24"/>
           <w:szCs w:val="24"/>
         </w:rPr>
-        <w:t xml:space="preserve">Arrange the five Knowledge Points in a natural learning sequence, beginning with the background or concept, progressing through institutional or legal dimensions, then </w:t>
-      </w:r>
-      <w:r>
-        <w:rPr>
-          <w:rFonts w:ascii="Calibri" w:hAnsi="Calibri" w:cs="Calibri"/>
-          <w:sz w:val="24"/>
-          <w:szCs w:val="24"/>
-        </w:rPr>
-        <w:lastRenderedPageBreak/>
-        <w:t>challenges, and ending with reforms, accountability, or future direction. Avoid random ordering.</w:t>
+        <w:t>Arrange the five Knowledge Points in a natural learning sequence, beginning with the background or concept, progressing through institutional or legal dimensions, then challenges, and ending with reforms, accountability, or future direction. Avoid random ordering.</w:t>
       </w:r>
     </w:p>
     <w:p>
@@ -5065,6 +4148,7 @@
           <w:szCs w:val="24"/>
           <w:lang w:eastAsia="en-IN"/>
         </w:rPr>
+        <w:lastRenderedPageBreak/>
         <w:t xml:space="preserve">Each Quick Fact should normally contain </w:t>
       </w:r>
       <w:r>
@@ -5442,7 +4526,6 @@
           <w:szCs w:val="24"/>
           <w:lang w:eastAsia="en-IN"/>
         </w:rPr>
-        <w:lastRenderedPageBreak/>
         <w:t xml:space="preserve">Before producing the final output, verify that </w:t>
       </w:r>
       <w:r>
@@ -5739,6 +4822,7 @@
           <w:szCs w:val="24"/>
           <w:lang w:eastAsia="en-IN"/>
         </w:rPr>
+        <w:lastRenderedPageBreak/>
         <w:t>If the Key Takeaway merely repeats the title, Today's Question, or any Knowledge Point, silently regenerate it before producing the final output.</w:t>
       </w:r>
     </w:p>
@@ -5989,7 +5073,6 @@
           <w:sz w:val="24"/>
           <w:szCs w:val="24"/>
         </w:rPr>
-        <w:lastRenderedPageBreak/>
         <w:t>Provide only the closest official UPSC syllabus phrase. Do not combine multiple syllabus phrases or create descriptive syllabus topics. Keep the complete GS Mapping concise enough to fit comfortably on a single line in the final publication</w:t>
       </w:r>
     </w:p>
@@ -6402,6 +5485,7 @@
           <w:szCs w:val="24"/>
           <w:lang w:eastAsia="en-IN"/>
         </w:rPr>
+        <w:lastRenderedPageBreak/>
         <w:t>The complete GS Mapping should normally fit on a single line and should never become visually larger than the Issue Title.</w:t>
       </w:r>
     </w:p>
@@ -6625,49 +5709,365 @@
           <w:szCs w:val="24"/>
           <w:lang w:eastAsia="en-IN"/>
         </w:rPr>
+        <w:t>Study the editorial thoroughly before answering.</w:t>
+      </w:r>
+    </w:p>
+    <w:p>
+      <w:pPr>
+        <w:spacing w:before="100" w:beforeAutospacing="1" w:after="100" w:afterAutospacing="1" w:line="240" w:lineRule="auto"/>
+        <w:rPr>
+          <w:rFonts w:ascii="Calibri" w:eastAsia="Times New Roman" w:hAnsi="Calibri" w:cs="Calibri"/>
+          <w:sz w:val="24"/>
+          <w:szCs w:val="24"/>
+          <w:lang w:eastAsia="en-IN"/>
+        </w:rPr>
+      </w:pPr>
+      <w:r>
+        <w:rPr>
+          <w:rFonts w:ascii="Calibri" w:eastAsia="Times New Roman" w:hAnsi="Calibri" w:cs="Calibri"/>
+          <w:sz w:val="24"/>
+          <w:szCs w:val="24"/>
+          <w:lang w:eastAsia="en-IN"/>
+        </w:rPr>
+        <w:t>Read the generated Today's Question carefully before writing the answer.</w:t>
+      </w:r>
+    </w:p>
+    <w:p>
+      <w:pPr>
+        <w:spacing w:before="100" w:beforeAutospacing="1" w:after="100" w:afterAutospacing="1" w:line="240" w:lineRule="auto"/>
+        <w:rPr>
+          <w:rFonts w:ascii="Calibri" w:eastAsia="Times New Roman" w:hAnsi="Calibri" w:cs="Calibri"/>
+          <w:sz w:val="24"/>
+          <w:szCs w:val="24"/>
+          <w:lang w:eastAsia="en-IN"/>
+        </w:rPr>
+      </w:pPr>
+      <w:r>
+        <w:rPr>
+          <w:rFonts w:ascii="Calibri" w:eastAsia="Times New Roman" w:hAnsi="Calibri" w:cs="Calibri"/>
+          <w:sz w:val="24"/>
+          <w:szCs w:val="24"/>
+          <w:lang w:eastAsia="en-IN"/>
+        </w:rPr>
+        <w:t xml:space="preserve">Your task is to answer </w:t>
+      </w:r>
+      <w:r>
+        <w:rPr>
+          <w:rFonts w:ascii="Calibri" w:eastAsia="Times New Roman" w:hAnsi="Calibri" w:cs="Calibri"/>
+          <w:bCs/>
+          <w:sz w:val="24"/>
+          <w:szCs w:val="24"/>
+          <w:lang w:eastAsia="en-IN"/>
+        </w:rPr>
+        <w:t>that exact question</w:t>
+      </w:r>
+      <w:r>
+        <w:rPr>
+          <w:rFonts w:ascii="Calibri" w:eastAsia="Times New Roman" w:hAnsi="Calibri" w:cs="Calibri"/>
+          <w:sz w:val="24"/>
+          <w:szCs w:val="24"/>
+          <w:lang w:eastAsia="en-IN"/>
+        </w:rPr>
+        <w:t xml:space="preserve"> in the style of a UPSC General Studies Mains answer while using the five Knowledge Points as the complete educational foundation.</w:t>
+      </w:r>
+    </w:p>
+    <w:p>
+      <w:pPr>
+        <w:spacing w:before="100" w:beforeAutospacing="1" w:after="100" w:afterAutospacing="1" w:line="240" w:lineRule="auto"/>
+        <w:rPr>
+          <w:rFonts w:ascii="Calibri" w:eastAsia="Times New Roman" w:hAnsi="Calibri" w:cs="Calibri"/>
+          <w:sz w:val="24"/>
+          <w:szCs w:val="24"/>
+          <w:lang w:eastAsia="en-IN"/>
+        </w:rPr>
+      </w:pPr>
+      <w:r>
+        <w:rPr>
+          <w:rFonts w:ascii="Calibri" w:eastAsia="Times New Roman" w:hAnsi="Calibri" w:cs="Calibri"/>
+          <w:sz w:val="24"/>
+          <w:szCs w:val="24"/>
+          <w:lang w:eastAsia="en-IN"/>
+        </w:rPr>
+        <w:t>Rewrite everything entirely in original language. Never preserve the editorial's wording, writing style, sentence structure, paragraph sequence, or distinctive expressions.</w:t>
+      </w:r>
+      <w:r>
+        <w:rPr>
+          <w:rFonts w:ascii="Calibri" w:hAnsi="Calibri" w:cs="Calibri"/>
+          <w:sz w:val="24"/>
+          <w:szCs w:val="24"/>
+        </w:rPr>
+        <w:t xml:space="preserve"> Begin the answer by directly addressing the demand of the question in one or two sentences before expanding into analysis.</w:t>
+      </w:r>
+    </w:p>
+    <w:p>
+      <w:pPr>
+        <w:spacing w:before="100" w:beforeAutospacing="1" w:after="100" w:afterAutospacing="1" w:line="240" w:lineRule="auto"/>
+        <w:rPr>
+          <w:rFonts w:ascii="Calibri" w:eastAsia="Times New Roman" w:hAnsi="Calibri" w:cs="Calibri"/>
+          <w:sz w:val="24"/>
+          <w:szCs w:val="24"/>
+          <w:lang w:eastAsia="en-IN"/>
+        </w:rPr>
+      </w:pPr>
+      <w:r>
+        <w:rPr>
+          <w:rFonts w:ascii="Calibri" w:eastAsia="Times New Roman" w:hAnsi="Calibri" w:cs="Calibri"/>
+          <w:sz w:val="24"/>
+          <w:szCs w:val="24"/>
+          <w:lang w:eastAsia="en-IN"/>
+        </w:rPr>
+        <w:t xml:space="preserve">Organise the answer into </w:t>
+      </w:r>
+      <w:r>
+        <w:rPr>
+          <w:rFonts w:ascii="Calibri" w:eastAsia="Times New Roman" w:hAnsi="Calibri" w:cs="Calibri"/>
+          <w:bCs/>
+          <w:sz w:val="24"/>
+          <w:szCs w:val="24"/>
+          <w:lang w:eastAsia="en-IN"/>
+        </w:rPr>
+        <w:t>exactly three paragraphs</w:t>
+      </w:r>
+      <w:r>
+        <w:rPr>
+          <w:rFonts w:ascii="Calibri" w:eastAsia="Times New Roman" w:hAnsi="Calibri" w:cs="Calibri"/>
+          <w:sz w:val="24"/>
+          <w:szCs w:val="24"/>
+          <w:lang w:eastAsia="en-IN"/>
+        </w:rPr>
+        <w:t>:</w:t>
+      </w:r>
+    </w:p>
+    <w:p>
+      <w:pPr>
+        <w:spacing w:before="100" w:beforeAutospacing="1" w:after="100" w:afterAutospacing="1" w:line="240" w:lineRule="auto"/>
+        <w:rPr>
+          <w:rFonts w:ascii="Calibri" w:eastAsia="Times New Roman" w:hAnsi="Calibri" w:cs="Calibri"/>
+          <w:sz w:val="24"/>
+          <w:szCs w:val="24"/>
+          <w:lang w:eastAsia="en-IN"/>
+        </w:rPr>
+      </w:pPr>
+      <w:r>
+        <w:rPr>
+          <w:rFonts w:ascii="Calibri" w:eastAsia="Times New Roman" w:hAnsi="Calibri" w:cs="Calibri"/>
+          <w:bCs/>
+          <w:sz w:val="24"/>
+          <w:szCs w:val="24"/>
+          <w:lang w:eastAsia="en-IN"/>
+        </w:rPr>
+        <w:t>Introduction</w:t>
+      </w:r>
+    </w:p>
+    <w:p>
+      <w:pPr>
+        <w:spacing w:before="100" w:beforeAutospacing="1" w:after="100" w:afterAutospacing="1" w:line="240" w:lineRule="auto"/>
+        <w:rPr>
+          <w:rFonts w:ascii="Calibri" w:eastAsia="Times New Roman" w:hAnsi="Calibri" w:cs="Calibri"/>
+          <w:sz w:val="24"/>
+          <w:szCs w:val="24"/>
+          <w:lang w:eastAsia="en-IN"/>
+        </w:rPr>
+      </w:pPr>
+      <w:r>
+        <w:rPr>
+          <w:rFonts w:ascii="Calibri" w:eastAsia="Times New Roman" w:hAnsi="Calibri" w:cs="Calibri"/>
+          <w:sz w:val="24"/>
+          <w:szCs w:val="24"/>
+          <w:lang w:eastAsia="en-IN"/>
+        </w:rPr>
+        <w:t>The Introduction should briefly establish the issue, define the central problem, and direc</w:t>
+      </w:r>
+      <w:r>
+        <w:rPr>
+          <w:rFonts w:ascii="Calibri" w:eastAsia="Times New Roman" w:hAnsi="Calibri" w:cs="Calibri"/>
+          <w:sz w:val="24"/>
+          <w:szCs w:val="24"/>
+          <w:lang w:eastAsia="en-IN"/>
+        </w:rPr>
+        <w:t>tly connect with the question of</w:t>
+      </w:r>
+      <w:r>
+        <w:rPr>
+          <w:rFonts w:ascii="Calibri" w:eastAsia="Times New Roman" w:hAnsi="Calibri" w:cs="Calibri"/>
+          <w:sz w:val="24"/>
+          <w:szCs w:val="24"/>
+          <w:lang w:eastAsia="en-IN"/>
+        </w:rPr>
+        <w:t xml:space="preserve"> </w:t>
+      </w:r>
+      <w:proofErr w:type="spellStart"/>
+      <w:r>
+        <w:rPr>
+          <w:rFonts w:ascii="Calibri" w:eastAsia="Times New Roman" w:hAnsi="Calibri" w:cs="Calibri"/>
+          <w:sz w:val="24"/>
+          <w:szCs w:val="24"/>
+          <w:lang w:eastAsia="en-IN"/>
+        </w:rPr>
+        <w:t>upto</w:t>
+      </w:r>
+      <w:proofErr w:type="spellEnd"/>
+      <w:r>
+        <w:rPr>
+          <w:rFonts w:ascii="Calibri" w:eastAsia="Times New Roman" w:hAnsi="Calibri" w:cs="Calibri"/>
+          <w:sz w:val="24"/>
+          <w:szCs w:val="24"/>
+          <w:lang w:eastAsia="en-IN"/>
+        </w:rPr>
+        <w:t xml:space="preserve"> </w:t>
+      </w:r>
+      <w:r>
+        <w:rPr>
+          <w:rFonts w:ascii="Calibri" w:eastAsia="Times New Roman" w:hAnsi="Calibri" w:cs="Calibri"/>
+          <w:bCs/>
+          <w:sz w:val="24"/>
+          <w:szCs w:val="24"/>
+          <w:lang w:eastAsia="en-IN"/>
+        </w:rPr>
+        <w:t>35–45 words</w:t>
+      </w:r>
+      <w:r>
+        <w:rPr>
+          <w:rFonts w:ascii="Calibri" w:eastAsia="Times New Roman" w:hAnsi="Calibri" w:cs="Calibri"/>
+          <w:bCs/>
+          <w:sz w:val="24"/>
+          <w:szCs w:val="24"/>
+          <w:lang w:eastAsia="en-IN"/>
+        </w:rPr>
+        <w:t xml:space="preserve"> only</w:t>
+      </w:r>
+      <w:r>
+        <w:rPr>
+          <w:rFonts w:ascii="Calibri" w:eastAsia="Times New Roman" w:hAnsi="Calibri" w:cs="Calibri"/>
+          <w:bCs/>
+          <w:sz w:val="24"/>
+          <w:szCs w:val="24"/>
+          <w:lang w:eastAsia="en-IN"/>
+        </w:rPr>
+        <w:t xml:space="preserve"> not more</w:t>
+      </w:r>
+      <w:r>
+        <w:rPr>
+          <w:rFonts w:ascii="Calibri" w:eastAsia="Times New Roman" w:hAnsi="Calibri" w:cs="Calibri"/>
+          <w:sz w:val="24"/>
+          <w:szCs w:val="24"/>
+          <w:lang w:eastAsia="en-IN"/>
+        </w:rPr>
+        <w:t>.</w:t>
+      </w:r>
+    </w:p>
+    <w:p>
+      <w:pPr>
+        <w:spacing w:before="100" w:beforeAutospacing="1" w:after="100" w:afterAutospacing="1" w:line="240" w:lineRule="auto"/>
+        <w:rPr>
+          <w:rFonts w:ascii="Calibri" w:eastAsia="Times New Roman" w:hAnsi="Calibri" w:cs="Calibri"/>
+          <w:sz w:val="24"/>
+          <w:szCs w:val="24"/>
+          <w:lang w:eastAsia="en-IN"/>
+        </w:rPr>
+      </w:pPr>
+      <w:r>
+        <w:rPr>
+          <w:rFonts w:ascii="Calibri" w:eastAsia="Times New Roman" w:hAnsi="Calibri" w:cs="Calibri"/>
+          <w:bCs/>
+          <w:sz w:val="24"/>
+          <w:szCs w:val="24"/>
+          <w:lang w:eastAsia="en-IN"/>
+        </w:rPr>
+        <w:t>Body</w:t>
+      </w:r>
+    </w:p>
+    <w:p>
+      <w:pPr>
+        <w:spacing w:before="100" w:beforeAutospacing="1" w:after="100" w:afterAutospacing="1" w:line="240" w:lineRule="auto"/>
+        <w:rPr>
+          <w:rFonts w:ascii="Calibri" w:eastAsia="Times New Roman" w:hAnsi="Calibri" w:cs="Calibri"/>
+          <w:sz w:val="24"/>
+          <w:szCs w:val="24"/>
+          <w:lang w:eastAsia="en-IN"/>
+        </w:rPr>
+      </w:pPr>
+      <w:r>
+        <w:rPr>
+          <w:rFonts w:ascii="Calibri" w:eastAsia="Times New Roman" w:hAnsi="Calibri" w:cs="Calibri"/>
+          <w:sz w:val="24"/>
+          <w:szCs w:val="24"/>
+          <w:lang w:eastAsia="en-IN"/>
+        </w:rPr>
+        <w:t>The Body should provide balanced analytical discussion using the Knowledge Points while naturally incorporating relevant constitutional provisions, laws, institutions, committees, reports, judgments, government initiatives, scientific concepts, policy developments, international organisations, and other verified educational concepts wherever they genuinely strengthen the answer.</w:t>
+      </w:r>
+    </w:p>
+    <w:p>
+      <w:pPr>
+        <w:spacing w:before="100" w:beforeAutospacing="1" w:after="100" w:afterAutospacing="1" w:line="240" w:lineRule="auto"/>
+        <w:rPr>
+          <w:rFonts w:ascii="Calibri" w:eastAsia="Times New Roman" w:hAnsi="Calibri" w:cs="Calibri"/>
+          <w:sz w:val="24"/>
+          <w:szCs w:val="24"/>
+          <w:lang w:eastAsia="en-IN"/>
+        </w:rPr>
+      </w:pPr>
+      <w:r>
+        <w:rPr>
+          <w:rFonts w:ascii="Calibri" w:eastAsia="Times New Roman" w:hAnsi="Calibri" w:cs="Calibri"/>
+          <w:sz w:val="24"/>
+          <w:szCs w:val="24"/>
+          <w:lang w:eastAsia="en-IN"/>
+        </w:rPr>
         <w:lastRenderedPageBreak/>
-        <w:t>Study the editorial thoroughly before answering.</w:t>
-      </w:r>
-    </w:p>
-    <w:p>
-      <w:pPr>
-        <w:spacing w:before="100" w:beforeAutospacing="1" w:after="100" w:afterAutospacing="1" w:line="240" w:lineRule="auto"/>
-        <w:rPr>
-          <w:rFonts w:ascii="Calibri" w:eastAsia="Times New Roman" w:hAnsi="Calibri" w:cs="Calibri"/>
-          <w:sz w:val="24"/>
-          <w:szCs w:val="24"/>
-          <w:lang w:eastAsia="en-IN"/>
-        </w:rPr>
-      </w:pPr>
-      <w:r>
-        <w:rPr>
-          <w:rFonts w:ascii="Calibri" w:eastAsia="Times New Roman" w:hAnsi="Calibri" w:cs="Calibri"/>
-          <w:sz w:val="24"/>
-          <w:szCs w:val="24"/>
-          <w:lang w:eastAsia="en-IN"/>
-        </w:rPr>
-        <w:t>Read the generated Today's Question carefully before writing the answer.</w:t>
-      </w:r>
-    </w:p>
-    <w:p>
-      <w:pPr>
-        <w:spacing w:before="100" w:beforeAutospacing="1" w:after="100" w:afterAutospacing="1" w:line="240" w:lineRule="auto"/>
-        <w:rPr>
-          <w:rFonts w:ascii="Calibri" w:eastAsia="Times New Roman" w:hAnsi="Calibri" w:cs="Calibri"/>
-          <w:sz w:val="24"/>
-          <w:szCs w:val="24"/>
-          <w:lang w:eastAsia="en-IN"/>
-        </w:rPr>
-      </w:pPr>
-      <w:r>
-        <w:rPr>
-          <w:rFonts w:ascii="Calibri" w:eastAsia="Times New Roman" w:hAnsi="Calibri" w:cs="Calibri"/>
-          <w:sz w:val="24"/>
-          <w:szCs w:val="24"/>
-          <w:lang w:eastAsia="en-IN"/>
-        </w:rPr>
-        <w:t xml:space="preserve">Your task is to answer </w:t>
-      </w:r>
+        <w:t>Whenever external knowledge improves educational quality, prefer authentic information from official government sources, constitutional bodies, statutory authorities, Supreme Court judgments, Parliamentary Committees, recognised commissions, official reports, reputed international organisations, or other reliable public sources.</w:t>
+      </w:r>
+    </w:p>
+    <w:p>
+      <w:pPr>
+        <w:spacing w:before="100" w:beforeAutospacing="1" w:after="100" w:afterAutospacing="1" w:line="240" w:lineRule="auto"/>
+        <w:rPr>
+          <w:rFonts w:ascii="Calibri" w:eastAsia="Times New Roman" w:hAnsi="Calibri" w:cs="Calibri"/>
+          <w:sz w:val="24"/>
+          <w:szCs w:val="24"/>
+          <w:lang w:eastAsia="en-IN"/>
+        </w:rPr>
+      </w:pPr>
+      <w:r>
+        <w:rPr>
+          <w:rFonts w:ascii="Calibri" w:eastAsia="Times New Roman" w:hAnsi="Calibri" w:cs="Calibri"/>
+          <w:sz w:val="24"/>
+          <w:szCs w:val="24"/>
+          <w:lang w:eastAsia="en-IN"/>
+        </w:rPr>
+        <w:t>Use recent verified developments only when they directly strengthen the answer. Never include speculative, opinion-based, or unverified information.</w:t>
+      </w:r>
+      <w:r>
+        <w:t xml:space="preserve"> The Body should normally contain </w:t>
+      </w:r>
+      <w:proofErr w:type="spellStart"/>
+      <w:r>
+        <w:t>upto</w:t>
+      </w:r>
+      <w:proofErr w:type="spellEnd"/>
+      <w:r>
+        <w:t xml:space="preserve"> </w:t>
+      </w:r>
+      <w:r>
+        <w:t>120–145 words</w:t>
+      </w:r>
+      <w:r>
+        <w:t xml:space="preserve"> only not more</w:t>
+      </w:r>
+      <w:r>
+        <w:t>.</w:t>
+      </w:r>
+    </w:p>
+    <w:p>
+      <w:pPr>
+        <w:spacing w:before="100" w:beforeAutospacing="1" w:after="100" w:afterAutospacing="1" w:line="240" w:lineRule="auto"/>
+        <w:rPr>
+          <w:rFonts w:ascii="Calibri" w:eastAsia="Times New Roman" w:hAnsi="Calibri" w:cs="Calibri"/>
+          <w:sz w:val="24"/>
+          <w:szCs w:val="24"/>
+          <w:lang w:eastAsia="en-IN"/>
+        </w:rPr>
+      </w:pPr>
       <w:r>
         <w:rPr>
           <w:rFonts w:ascii="Calibri" w:eastAsia="Times New Roman" w:hAnsi="Calibri" w:cs="Calibri"/>
@@ -6676,64 +6076,65 @@
           <w:szCs w:val="24"/>
           <w:lang w:eastAsia="en-IN"/>
         </w:rPr>
-        <w:t>that exact question</w:t>
-      </w:r>
-      <w:r>
-        <w:rPr>
-          <w:rFonts w:ascii="Calibri" w:eastAsia="Times New Roman" w:hAnsi="Calibri" w:cs="Calibri"/>
-          <w:sz w:val="24"/>
-          <w:szCs w:val="24"/>
-          <w:lang w:eastAsia="en-IN"/>
-        </w:rPr>
-        <w:t xml:space="preserve"> in the style of a UPSC General Studies Mains answer while using the five Knowledge Points as the complete educational foundation.</w:t>
-      </w:r>
-    </w:p>
-    <w:p>
-      <w:pPr>
-        <w:spacing w:before="100" w:beforeAutospacing="1" w:after="100" w:afterAutospacing="1" w:line="240" w:lineRule="auto"/>
-        <w:rPr>
-          <w:rFonts w:ascii="Calibri" w:eastAsia="Times New Roman" w:hAnsi="Calibri" w:cs="Calibri"/>
-          <w:sz w:val="24"/>
-          <w:szCs w:val="24"/>
-          <w:lang w:eastAsia="en-IN"/>
-        </w:rPr>
-      </w:pPr>
-      <w:r>
-        <w:rPr>
-          <w:rFonts w:ascii="Calibri" w:eastAsia="Times New Roman" w:hAnsi="Calibri" w:cs="Calibri"/>
-          <w:sz w:val="24"/>
-          <w:szCs w:val="24"/>
-          <w:lang w:eastAsia="en-IN"/>
-        </w:rPr>
-        <w:t>Rewrite everything entirely in original language. Never preserve the editorial's wording, writing style, sentence structure, paragraph sequence, or distinctive expressions.</w:t>
-      </w:r>
-      <w:r>
-        <w:rPr>
-          <w:rFonts w:ascii="Calibri" w:hAnsi="Calibri" w:cs="Calibri"/>
-          <w:sz w:val="24"/>
-          <w:szCs w:val="24"/>
-        </w:rPr>
-        <w:t xml:space="preserve"> Begin the answer by directly addressing the demand of the question in one or two sentences before expanding into analysis.</w:t>
-      </w:r>
-    </w:p>
-    <w:p>
-      <w:pPr>
-        <w:spacing w:before="100" w:beforeAutospacing="1" w:after="100" w:afterAutospacing="1" w:line="240" w:lineRule="auto"/>
-        <w:rPr>
-          <w:rFonts w:ascii="Calibri" w:eastAsia="Times New Roman" w:hAnsi="Calibri" w:cs="Calibri"/>
-          <w:sz w:val="24"/>
-          <w:szCs w:val="24"/>
-          <w:lang w:eastAsia="en-IN"/>
-        </w:rPr>
-      </w:pPr>
-      <w:r>
-        <w:rPr>
-          <w:rFonts w:ascii="Calibri" w:eastAsia="Times New Roman" w:hAnsi="Calibri" w:cs="Calibri"/>
-          <w:sz w:val="24"/>
-          <w:szCs w:val="24"/>
-          <w:lang w:eastAsia="en-IN"/>
-        </w:rPr>
-        <w:t xml:space="preserve">Organise the answer into </w:t>
+        <w:t>Conclusion</w:t>
+      </w:r>
+    </w:p>
+    <w:p>
+      <w:pPr>
+        <w:spacing w:before="100" w:beforeAutospacing="1" w:after="100" w:afterAutospacing="1" w:line="240" w:lineRule="auto"/>
+        <w:rPr>
+          <w:rFonts w:ascii="Calibri" w:eastAsia="Times New Roman" w:hAnsi="Calibri" w:cs="Calibri"/>
+          <w:sz w:val="24"/>
+          <w:szCs w:val="24"/>
+          <w:lang w:eastAsia="en-IN"/>
+        </w:rPr>
+      </w:pPr>
+      <w:r>
+        <w:rPr>
+          <w:rFonts w:ascii="Calibri" w:eastAsia="Times New Roman" w:hAnsi="Calibri" w:cs="Calibri"/>
+          <w:sz w:val="24"/>
+          <w:szCs w:val="24"/>
+          <w:lang w:eastAsia="en-IN"/>
+        </w:rPr>
+        <w:t>The Conclusion should present a balanced, practical, solution-orien</w:t>
+      </w:r>
+      <w:r>
+        <w:rPr>
+          <w:rFonts w:ascii="Calibri" w:eastAsia="Times New Roman" w:hAnsi="Calibri" w:cs="Calibri"/>
+          <w:sz w:val="24"/>
+          <w:szCs w:val="24"/>
+          <w:lang w:eastAsia="en-IN"/>
+        </w:rPr>
+        <w:t>ted perspective in</w:t>
+      </w:r>
+      <w:r>
+        <w:rPr>
+          <w:rFonts w:ascii="Calibri" w:eastAsia="Times New Roman" w:hAnsi="Calibri" w:cs="Calibri"/>
+          <w:sz w:val="24"/>
+          <w:szCs w:val="24"/>
+          <w:lang w:eastAsia="en-IN"/>
+        </w:rPr>
+        <w:t xml:space="preserve"> </w:t>
+      </w:r>
+      <w:proofErr w:type="spellStart"/>
+      <w:r>
+        <w:rPr>
+          <w:rFonts w:ascii="Calibri" w:eastAsia="Times New Roman" w:hAnsi="Calibri" w:cs="Calibri"/>
+          <w:sz w:val="24"/>
+          <w:szCs w:val="24"/>
+          <w:lang w:eastAsia="en-IN"/>
+        </w:rPr>
+        <w:t>upto</w:t>
+      </w:r>
+      <w:proofErr w:type="spellEnd"/>
+      <w:r>
+        <w:rPr>
+          <w:rFonts w:ascii="Calibri" w:eastAsia="Times New Roman" w:hAnsi="Calibri" w:cs="Calibri"/>
+          <w:sz w:val="24"/>
+          <w:szCs w:val="24"/>
+          <w:lang w:eastAsia="en-IN"/>
+        </w:rPr>
+        <w:t xml:space="preserve"> </w:t>
       </w:r>
       <w:r>
         <w:rPr>
@@ -6743,28 +6144,8 @@
           <w:szCs w:val="24"/>
           <w:lang w:eastAsia="en-IN"/>
         </w:rPr>
-        <w:t>exactly three paragraphs</w:t>
-      </w:r>
-      <w:r>
-        <w:rPr>
-          <w:rFonts w:ascii="Calibri" w:eastAsia="Times New Roman" w:hAnsi="Calibri" w:cs="Calibri"/>
-          <w:sz w:val="24"/>
-          <w:szCs w:val="24"/>
-          <w:lang w:eastAsia="en-IN"/>
-        </w:rPr>
-        <w:t>:</w:t>
-      </w:r>
-    </w:p>
-    <w:p>
-      <w:pPr>
-        <w:spacing w:before="100" w:beforeAutospacing="1" w:after="100" w:afterAutospacing="1" w:line="240" w:lineRule="auto"/>
-        <w:rPr>
-          <w:rFonts w:ascii="Calibri" w:eastAsia="Times New Roman" w:hAnsi="Calibri" w:cs="Calibri"/>
-          <w:sz w:val="24"/>
-          <w:szCs w:val="24"/>
-          <w:lang w:eastAsia="en-IN"/>
-        </w:rPr>
-      </w:pPr>
+        <w:t>30–40 words</w:t>
+      </w:r>
       <w:r>
         <w:rPr>
           <w:rFonts w:ascii="Calibri" w:eastAsia="Times New Roman" w:hAnsi="Calibri" w:cs="Calibri"/>
@@ -6773,65 +6154,7 @@
           <w:szCs w:val="24"/>
           <w:lang w:eastAsia="en-IN"/>
         </w:rPr>
-        <w:t>Introduction</w:t>
-      </w:r>
-    </w:p>
-    <w:p>
-      <w:pPr>
-        <w:spacing w:before="100" w:beforeAutospacing="1" w:after="100" w:afterAutospacing="1" w:line="240" w:lineRule="auto"/>
-        <w:rPr>
-          <w:rFonts w:ascii="Calibri" w:eastAsia="Times New Roman" w:hAnsi="Calibri" w:cs="Calibri"/>
-          <w:sz w:val="24"/>
-          <w:szCs w:val="24"/>
-          <w:lang w:eastAsia="en-IN"/>
-        </w:rPr>
-      </w:pPr>
-      <w:r>
-        <w:rPr>
-          <w:rFonts w:ascii="Calibri" w:eastAsia="Times New Roman" w:hAnsi="Calibri" w:cs="Calibri"/>
-          <w:sz w:val="24"/>
-          <w:szCs w:val="24"/>
-          <w:lang w:eastAsia="en-IN"/>
-        </w:rPr>
-        <w:t>The Introduction should briefly establish the issue, define the central problem, and direc</w:t>
-      </w:r>
-      <w:r>
-        <w:rPr>
-          <w:rFonts w:ascii="Calibri" w:eastAsia="Times New Roman" w:hAnsi="Calibri" w:cs="Calibri"/>
-          <w:sz w:val="24"/>
-          <w:szCs w:val="24"/>
-          <w:lang w:eastAsia="en-IN"/>
-        </w:rPr>
-        <w:t>tly connect with the question of</w:t>
-      </w:r>
-      <w:r>
-        <w:rPr>
-          <w:rFonts w:ascii="Calibri" w:eastAsia="Times New Roman" w:hAnsi="Calibri" w:cs="Calibri"/>
-          <w:sz w:val="24"/>
-          <w:szCs w:val="24"/>
-          <w:lang w:eastAsia="en-IN"/>
-        </w:rPr>
-        <w:t xml:space="preserve"> </w:t>
-      </w:r>
-      <w:proofErr w:type="spellStart"/>
-      <w:r>
-        <w:rPr>
-          <w:rFonts w:ascii="Calibri" w:eastAsia="Times New Roman" w:hAnsi="Calibri" w:cs="Calibri"/>
-          <w:sz w:val="24"/>
-          <w:szCs w:val="24"/>
-          <w:lang w:eastAsia="en-IN"/>
-        </w:rPr>
-        <w:t>upto</w:t>
-      </w:r>
-      <w:proofErr w:type="spellEnd"/>
-      <w:r>
-        <w:rPr>
-          <w:rFonts w:ascii="Calibri" w:eastAsia="Times New Roman" w:hAnsi="Calibri" w:cs="Calibri"/>
-          <w:sz w:val="24"/>
-          <w:szCs w:val="24"/>
-          <w:lang w:eastAsia="en-IN"/>
-        </w:rPr>
-        <w:t xml:space="preserve"> </w:t>
+        <w:t xml:space="preserve"> only</w:t>
       </w:r>
       <w:r>
         <w:rPr>
@@ -6841,7 +6164,36 @@
           <w:szCs w:val="24"/>
           <w:lang w:eastAsia="en-IN"/>
         </w:rPr>
-        <w:t>35–45 words</w:t>
+        <w:t xml:space="preserve"> not more</w:t>
+      </w:r>
+      <w:r>
+        <w:rPr>
+          <w:rFonts w:ascii="Calibri" w:eastAsia="Times New Roman" w:hAnsi="Calibri" w:cs="Calibri"/>
+          <w:sz w:val="24"/>
+          <w:szCs w:val="24"/>
+          <w:lang w:eastAsia="en-IN"/>
+        </w:rPr>
+        <w:t>, ending with a constructive forward-looking observation.</w:t>
+      </w:r>
+    </w:p>
+    <w:p>
+      <w:pPr>
+        <w:spacing w:before="100" w:beforeAutospacing="1" w:after="100" w:afterAutospacing="1" w:line="240" w:lineRule="auto"/>
+        <w:rPr>
+          <w:rFonts w:ascii="Calibri" w:eastAsia="Times New Roman" w:hAnsi="Calibri" w:cs="Calibri"/>
+          <w:sz w:val="24"/>
+          <w:szCs w:val="24"/>
+          <w:lang w:eastAsia="en-IN"/>
+        </w:rPr>
+      </w:pPr>
+      <w:r>
+        <w:rPr>
+          <w:rFonts w:ascii="Calibri" w:eastAsia="Times New Roman" w:hAnsi="Calibri" w:cs="Calibri"/>
+          <w:sz w:val="24"/>
+          <w:szCs w:val="24"/>
+          <w:lang w:eastAsia="en-IN"/>
+        </w:rPr>
+        <w:t xml:space="preserve">The complete answer should normally contain </w:t>
       </w:r>
       <w:r>
         <w:rPr>
@@ -6851,7 +6203,16 @@
           <w:szCs w:val="24"/>
           <w:lang w:eastAsia="en-IN"/>
         </w:rPr>
-        <w:t xml:space="preserve"> only</w:t>
+        <w:t>190–225 words</w:t>
+      </w:r>
+      <w:r>
+        <w:rPr>
+          <w:rFonts w:ascii="Calibri" w:eastAsia="Times New Roman" w:hAnsi="Calibri" w:cs="Calibri"/>
+          <w:sz w:val="24"/>
+          <w:szCs w:val="24"/>
+          <w:lang w:eastAsia="en-IN"/>
+        </w:rPr>
+        <w:t xml:space="preserve"> and should </w:t>
       </w:r>
       <w:r>
         <w:rPr>
@@ -6861,7 +6222,7 @@
           <w:szCs w:val="24"/>
           <w:lang w:eastAsia="en-IN"/>
         </w:rPr>
-        <w:t xml:space="preserve"> not more</w:t>
+        <w:t>never exceed 230 words</w:t>
       </w:r>
       <w:r>
         <w:rPr>
@@ -6886,283 +6247,6 @@
       <w:r>
         <w:rPr>
           <w:rFonts w:ascii="Calibri" w:eastAsia="Times New Roman" w:hAnsi="Calibri" w:cs="Calibri"/>
-          <w:bCs/>
-          <w:sz w:val="24"/>
-          <w:szCs w:val="24"/>
-          <w:lang w:eastAsia="en-IN"/>
-        </w:rPr>
-        <w:t>Body</w:t>
-      </w:r>
-    </w:p>
-    <w:p>
-      <w:pPr>
-        <w:spacing w:before="100" w:beforeAutospacing="1" w:after="100" w:afterAutospacing="1" w:line="240" w:lineRule="auto"/>
-        <w:rPr>
-          <w:rFonts w:ascii="Calibri" w:eastAsia="Times New Roman" w:hAnsi="Calibri" w:cs="Calibri"/>
-          <w:sz w:val="24"/>
-          <w:szCs w:val="24"/>
-          <w:lang w:eastAsia="en-IN"/>
-        </w:rPr>
-      </w:pPr>
-      <w:r>
-        <w:rPr>
-          <w:rFonts w:ascii="Calibri" w:eastAsia="Times New Roman" w:hAnsi="Calibri" w:cs="Calibri"/>
-          <w:sz w:val="24"/>
-          <w:szCs w:val="24"/>
-          <w:lang w:eastAsia="en-IN"/>
-        </w:rPr>
-        <w:t>The Body should provide balanced analytical discussion using the Knowledge Points while naturally incorporating relevant constitutional provisions, laws, institutions, committees, reports, judgments, government initiatives, scientific concepts, policy developments, international organisations, and other verified educational concepts wherever they genuinely strengthen the answer.</w:t>
-      </w:r>
-    </w:p>
-    <w:p>
-      <w:pPr>
-        <w:spacing w:before="100" w:beforeAutospacing="1" w:after="100" w:afterAutospacing="1" w:line="240" w:lineRule="auto"/>
-        <w:rPr>
-          <w:rFonts w:ascii="Calibri" w:eastAsia="Times New Roman" w:hAnsi="Calibri" w:cs="Calibri"/>
-          <w:sz w:val="24"/>
-          <w:szCs w:val="24"/>
-          <w:lang w:eastAsia="en-IN"/>
-        </w:rPr>
-      </w:pPr>
-      <w:r>
-        <w:rPr>
-          <w:rFonts w:ascii="Calibri" w:eastAsia="Times New Roman" w:hAnsi="Calibri" w:cs="Calibri"/>
-          <w:sz w:val="24"/>
-          <w:szCs w:val="24"/>
-          <w:lang w:eastAsia="en-IN"/>
-        </w:rPr>
-        <w:t>Whenever external knowledge improves educational quality, prefer authentic information from official government sources, constitutional bodies, statutory authorities, Supreme Court judgments, Parliamentary Committees, recognised commissions, official reports, reputed international organisations, or other reliable public sources.</w:t>
-      </w:r>
-    </w:p>
-    <w:p>
-      <w:pPr>
-        <w:spacing w:before="100" w:beforeAutospacing="1" w:after="100" w:afterAutospacing="1" w:line="240" w:lineRule="auto"/>
-        <w:rPr>
-          <w:rFonts w:ascii="Calibri" w:eastAsia="Times New Roman" w:hAnsi="Calibri" w:cs="Calibri"/>
-          <w:sz w:val="24"/>
-          <w:szCs w:val="24"/>
-          <w:lang w:eastAsia="en-IN"/>
-        </w:rPr>
-      </w:pPr>
-      <w:r>
-        <w:rPr>
-          <w:rFonts w:ascii="Calibri" w:eastAsia="Times New Roman" w:hAnsi="Calibri" w:cs="Calibri"/>
-          <w:sz w:val="24"/>
-          <w:szCs w:val="24"/>
-          <w:lang w:eastAsia="en-IN"/>
-        </w:rPr>
-        <w:t>Use recent verified developments only when they directly strengthen the answer. Never include speculative, opinion-based, or unverified information.</w:t>
-      </w:r>
-      <w:r>
-        <w:t xml:space="preserve"> The Body should normally contain </w:t>
-      </w:r>
-      <w:proofErr w:type="spellStart"/>
-      <w:r>
-        <w:t>upto</w:t>
-      </w:r>
-      <w:proofErr w:type="spellEnd"/>
-      <w:r>
-        <w:t xml:space="preserve"> </w:t>
-      </w:r>
-      <w:r>
-        <w:t>120–145 words</w:t>
-      </w:r>
-      <w:r>
-        <w:t xml:space="preserve"> only not more</w:t>
-      </w:r>
-      <w:r>
-        <w:t>.</w:t>
-      </w:r>
-    </w:p>
-    <w:p>
-      <w:pPr>
-        <w:spacing w:before="100" w:beforeAutospacing="1" w:after="100" w:afterAutospacing="1" w:line="240" w:lineRule="auto"/>
-        <w:rPr>
-          <w:rFonts w:ascii="Calibri" w:eastAsia="Times New Roman" w:hAnsi="Calibri" w:cs="Calibri"/>
-          <w:sz w:val="24"/>
-          <w:szCs w:val="24"/>
-          <w:lang w:eastAsia="en-IN"/>
-        </w:rPr>
-      </w:pPr>
-      <w:r>
-        <w:rPr>
-          <w:rFonts w:ascii="Calibri" w:eastAsia="Times New Roman" w:hAnsi="Calibri" w:cs="Calibri"/>
-          <w:bCs/>
-          <w:sz w:val="24"/>
-          <w:szCs w:val="24"/>
-          <w:lang w:eastAsia="en-IN"/>
-        </w:rPr>
-        <w:t>Conclusion</w:t>
-      </w:r>
-    </w:p>
-    <w:p>
-      <w:pPr>
-        <w:spacing w:before="100" w:beforeAutospacing="1" w:after="100" w:afterAutospacing="1" w:line="240" w:lineRule="auto"/>
-        <w:rPr>
-          <w:rFonts w:ascii="Calibri" w:eastAsia="Times New Roman" w:hAnsi="Calibri" w:cs="Calibri"/>
-          <w:sz w:val="24"/>
-          <w:szCs w:val="24"/>
-          <w:lang w:eastAsia="en-IN"/>
-        </w:rPr>
-      </w:pPr>
-      <w:r>
-        <w:rPr>
-          <w:rFonts w:ascii="Calibri" w:eastAsia="Times New Roman" w:hAnsi="Calibri" w:cs="Calibri"/>
-          <w:sz w:val="24"/>
-          <w:szCs w:val="24"/>
-          <w:lang w:eastAsia="en-IN"/>
-        </w:rPr>
-        <w:t>The Conclusion should present a balanced, practical, solution-orien</w:t>
-      </w:r>
-      <w:r>
-        <w:rPr>
-          <w:rFonts w:ascii="Calibri" w:eastAsia="Times New Roman" w:hAnsi="Calibri" w:cs="Calibri"/>
-          <w:sz w:val="24"/>
-          <w:szCs w:val="24"/>
-          <w:lang w:eastAsia="en-IN"/>
-        </w:rPr>
-        <w:t>ted perspective in</w:t>
-      </w:r>
-      <w:r>
-        <w:rPr>
-          <w:rFonts w:ascii="Calibri" w:eastAsia="Times New Roman" w:hAnsi="Calibri" w:cs="Calibri"/>
-          <w:sz w:val="24"/>
-          <w:szCs w:val="24"/>
-          <w:lang w:eastAsia="en-IN"/>
-        </w:rPr>
-        <w:t xml:space="preserve"> </w:t>
-      </w:r>
-      <w:proofErr w:type="spellStart"/>
-      <w:r>
-        <w:rPr>
-          <w:rFonts w:ascii="Calibri" w:eastAsia="Times New Roman" w:hAnsi="Calibri" w:cs="Calibri"/>
-          <w:sz w:val="24"/>
-          <w:szCs w:val="24"/>
-          <w:lang w:eastAsia="en-IN"/>
-        </w:rPr>
-        <w:t>upto</w:t>
-      </w:r>
-      <w:proofErr w:type="spellEnd"/>
-      <w:r>
-        <w:rPr>
-          <w:rFonts w:ascii="Calibri" w:eastAsia="Times New Roman" w:hAnsi="Calibri" w:cs="Calibri"/>
-          <w:sz w:val="24"/>
-          <w:szCs w:val="24"/>
-          <w:lang w:eastAsia="en-IN"/>
-        </w:rPr>
-        <w:t xml:space="preserve"> </w:t>
-      </w:r>
-      <w:r>
-        <w:rPr>
-          <w:rFonts w:ascii="Calibri" w:eastAsia="Times New Roman" w:hAnsi="Calibri" w:cs="Calibri"/>
-          <w:bCs/>
-          <w:sz w:val="24"/>
-          <w:szCs w:val="24"/>
-          <w:lang w:eastAsia="en-IN"/>
-        </w:rPr>
-        <w:t>30–40 words</w:t>
-      </w:r>
-      <w:r>
-        <w:rPr>
-          <w:rFonts w:ascii="Calibri" w:eastAsia="Times New Roman" w:hAnsi="Calibri" w:cs="Calibri"/>
-          <w:bCs/>
-          <w:sz w:val="24"/>
-          <w:szCs w:val="24"/>
-          <w:lang w:eastAsia="en-IN"/>
-        </w:rPr>
-        <w:t xml:space="preserve"> only</w:t>
-      </w:r>
-      <w:r>
-        <w:rPr>
-          <w:rFonts w:ascii="Calibri" w:eastAsia="Times New Roman" w:hAnsi="Calibri" w:cs="Calibri"/>
-          <w:bCs/>
-          <w:sz w:val="24"/>
-          <w:szCs w:val="24"/>
-          <w:lang w:eastAsia="en-IN"/>
-        </w:rPr>
-        <w:t xml:space="preserve"> not more</w:t>
-      </w:r>
-      <w:r>
-        <w:rPr>
-          <w:rFonts w:ascii="Calibri" w:eastAsia="Times New Roman" w:hAnsi="Calibri" w:cs="Calibri"/>
-          <w:sz w:val="24"/>
-          <w:szCs w:val="24"/>
-          <w:lang w:eastAsia="en-IN"/>
-        </w:rPr>
-        <w:t>, ending with a constructive forward-looking observation.</w:t>
-      </w:r>
-    </w:p>
-    <w:p>
-      <w:pPr>
-        <w:spacing w:before="100" w:beforeAutospacing="1" w:after="100" w:afterAutospacing="1" w:line="240" w:lineRule="auto"/>
-        <w:rPr>
-          <w:rFonts w:ascii="Calibri" w:eastAsia="Times New Roman" w:hAnsi="Calibri" w:cs="Calibri"/>
-          <w:sz w:val="24"/>
-          <w:szCs w:val="24"/>
-          <w:lang w:eastAsia="en-IN"/>
-        </w:rPr>
-      </w:pPr>
-      <w:r>
-        <w:rPr>
-          <w:rFonts w:ascii="Calibri" w:eastAsia="Times New Roman" w:hAnsi="Calibri" w:cs="Calibri"/>
-          <w:sz w:val="24"/>
-          <w:szCs w:val="24"/>
-          <w:lang w:eastAsia="en-IN"/>
-        </w:rPr>
-        <w:t xml:space="preserve">The complete answer should normally contain </w:t>
-      </w:r>
-      <w:r>
-        <w:rPr>
-          <w:rFonts w:ascii="Calibri" w:eastAsia="Times New Roman" w:hAnsi="Calibri" w:cs="Calibri"/>
-          <w:bCs/>
-          <w:sz w:val="24"/>
-          <w:szCs w:val="24"/>
-          <w:lang w:eastAsia="en-IN"/>
-        </w:rPr>
-        <w:t>190–225 words</w:t>
-      </w:r>
-      <w:r>
-        <w:rPr>
-          <w:rFonts w:ascii="Calibri" w:eastAsia="Times New Roman" w:hAnsi="Calibri" w:cs="Calibri"/>
-          <w:sz w:val="24"/>
-          <w:szCs w:val="24"/>
-          <w:lang w:eastAsia="en-IN"/>
-        </w:rPr>
-        <w:t xml:space="preserve"> and should </w:t>
-      </w:r>
-      <w:r>
-        <w:rPr>
-          <w:rFonts w:ascii="Calibri" w:eastAsia="Times New Roman" w:hAnsi="Calibri" w:cs="Calibri"/>
-          <w:bCs/>
-          <w:sz w:val="24"/>
-          <w:szCs w:val="24"/>
-          <w:lang w:eastAsia="en-IN"/>
-        </w:rPr>
-        <w:t>never exceed 230 words</w:t>
-      </w:r>
-      <w:r>
-        <w:rPr>
-          <w:rFonts w:ascii="Calibri" w:eastAsia="Times New Roman" w:hAnsi="Calibri" w:cs="Calibri"/>
-          <w:sz w:val="24"/>
-          <w:szCs w:val="24"/>
-          <w:lang w:eastAsia="en-IN"/>
-        </w:rPr>
-        <w:t>.</w:t>
-      </w:r>
-    </w:p>
-    <w:p>
-      <w:pPr>
-        <w:spacing w:before="100" w:beforeAutospacing="1" w:after="100" w:afterAutospacing="1" w:line="240" w:lineRule="auto"/>
-        <w:rPr>
-          <w:rFonts w:ascii="Calibri" w:eastAsia="Times New Roman" w:hAnsi="Calibri" w:cs="Calibri"/>
-          <w:sz w:val="24"/>
-          <w:szCs w:val="24"/>
-          <w:lang w:eastAsia="en-IN"/>
-        </w:rPr>
-      </w:pPr>
-      <w:r>
-        <w:rPr>
-          <w:rFonts w:ascii="Calibri" w:eastAsia="Times New Roman" w:hAnsi="Calibri" w:cs="Calibri"/>
           <w:sz w:val="24"/>
           <w:szCs w:val="24"/>
           <w:lang w:eastAsia="en-IN"/>
@@ -7207,7 +6291,6 @@
           <w:szCs w:val="24"/>
           <w:lang w:eastAsia="en-IN"/>
         </w:rPr>
-        <w:lastRenderedPageBreak/>
         <w:t>Avoid repetition, unnecessary jargon, decorative language, excessive background information, or editorial narration.</w:t>
       </w:r>
     </w:p>
@@ -7389,6 +6472,7 @@
           <w:szCs w:val="24"/>
           <w:lang w:eastAsia="en-IN"/>
         </w:rPr>
+        <w:lastRenderedPageBreak/>
         <w:t xml:space="preserve">Generate exactly </w:t>
       </w:r>
       <w:r>
@@ -7610,7 +6694,6 @@
           <w:szCs w:val="24"/>
           <w:lang w:eastAsia="en-IN"/>
         </w:rPr>
-        <w:lastRenderedPageBreak/>
         <w:t>Every question must:</w:t>
       </w:r>
     </w:p>
@@ -7966,6 +7049,7 @@
           <w:szCs w:val="24"/>
           <w:lang w:eastAsia="en-IN"/>
         </w:rPr>
+        <w:lastRenderedPageBreak/>
         <w:t>The explanation should briefly justify why the correct option is correct and, wherever useful, explain why the remaining options are incorrect. The explanation should strengthen conceptual understanding rather than merely reveal the answer.</w:t>
       </w:r>
     </w:p>
@@ -8312,7 +7396,6 @@
           <w:szCs w:val="24"/>
           <w:lang w:eastAsia="en-IN"/>
         </w:rPr>
-        <w:lastRenderedPageBreak/>
         <w:t>EDITORIAL SOURCE(S)</w:t>
       </w:r>
     </w:p>
@@ -9173,6 +8256,7 @@
           <w:szCs w:val="24"/>
           <w:lang w:eastAsia="en-IN"/>
         </w:rPr>
+        <w:lastRenderedPageBreak/>
         <w:t>KEY TAKEAWAY</w:t>
       </w:r>
     </w:p>
@@ -9675,143 +8759,143 @@
           <w:szCs w:val="24"/>
           <w:lang w:eastAsia="en-IN"/>
         </w:rPr>
+        <w:t>Each topic must be completely self-contained and ready for direct processing by the downstream production pipeline.</w:t>
+      </w:r>
+    </w:p>
+    <w:p>
+      <w:pPr>
+        <w:spacing w:before="100" w:beforeAutospacing="1" w:after="100" w:afterAutospacing="1" w:line="240" w:lineRule="auto"/>
+        <w:rPr>
+          <w:rFonts w:ascii="Calibri" w:eastAsia="Times New Roman" w:hAnsi="Calibri" w:cs="Calibri"/>
+          <w:sz w:val="24"/>
+          <w:szCs w:val="24"/>
+          <w:lang w:eastAsia="en-IN"/>
+        </w:rPr>
+      </w:pPr>
+      <w:r>
+        <w:rPr>
+          <w:rFonts w:ascii="Calibri" w:eastAsia="Times New Roman" w:hAnsi="Calibri" w:cs="Calibri"/>
+          <w:sz w:val="24"/>
+          <w:szCs w:val="24"/>
+          <w:lang w:eastAsia="en-IN"/>
+        </w:rPr>
+        <w:t>Maintain consistent formatting, spacing, heading style, and terminology across all generated topics.</w:t>
+      </w:r>
+    </w:p>
+    <w:p>
+      <w:pPr>
+        <w:spacing w:before="100" w:beforeAutospacing="1" w:after="100" w:afterAutospacing="1" w:line="240" w:lineRule="auto"/>
+        <w:rPr>
+          <w:rFonts w:ascii="Calibri" w:eastAsia="Times New Roman" w:hAnsi="Calibri" w:cs="Calibri"/>
+          <w:sz w:val="24"/>
+          <w:szCs w:val="24"/>
+          <w:lang w:eastAsia="en-IN"/>
+        </w:rPr>
+      </w:pPr>
+      <w:r>
+        <w:rPr>
+          <w:rFonts w:ascii="Calibri" w:eastAsia="Times New Roman" w:hAnsi="Calibri" w:cs="Calibri"/>
+          <w:sz w:val="24"/>
+          <w:szCs w:val="24"/>
+          <w:lang w:eastAsia="en-IN"/>
+        </w:rPr>
+        <w:t>When multiple topics are selected, generate only one complete topic at a time and wait for the user's instruction before generating the next selected topic.</w:t>
+      </w:r>
+    </w:p>
+    <w:p>
+      <w:pPr>
+        <w:pStyle w:val="Heading1"/>
+        <w:rPr>
+          <w:rFonts w:ascii="Calibri" w:hAnsi="Calibri" w:cs="Calibri"/>
+          <w:b w:val="0"/>
+          <w:sz w:val="24"/>
+          <w:szCs w:val="24"/>
+        </w:rPr>
+      </w:pPr>
+      <w:r>
+        <w:rPr>
+          <w:rFonts w:ascii="Calibri" w:hAnsi="Calibri" w:cs="Calibri"/>
+          <w:b w:val="0"/>
+          <w:sz w:val="24"/>
+          <w:szCs w:val="24"/>
+        </w:rPr>
+        <w:t>FINAL QUALITY VALIDATION</w:t>
+      </w:r>
+    </w:p>
+    <w:p>
+      <w:pPr>
+        <w:pStyle w:val="NormalWeb"/>
+        <w:rPr>
+          <w:rFonts w:ascii="Calibri" w:hAnsi="Calibri" w:cs="Calibri"/>
+        </w:rPr>
+      </w:pPr>
+      <w:r>
+        <w:rPr>
+          <w:rFonts w:ascii="Calibri" w:hAnsi="Calibri" w:cs="Calibri"/>
+        </w:rPr>
+        <w:t>Before producing the final output, perform a complete internal quality review. Do not display this validation to the user.</w:t>
+      </w:r>
+    </w:p>
+    <w:p>
+      <w:pPr>
+        <w:pStyle w:val="NormalWeb"/>
+        <w:rPr>
+          <w:rFonts w:ascii="Calibri" w:hAnsi="Calibri" w:cs="Calibri"/>
+        </w:rPr>
+      </w:pPr>
+      <w:r>
+        <w:rPr>
+          <w:rFonts w:ascii="Calibri" w:hAnsi="Calibri" w:cs="Calibri"/>
+        </w:rPr>
+        <w:t xml:space="preserve">Treat this validation as mandatory. Every generated topic must successfully satisfy every requirement defined in this prompt before it is presented. If any section fails validation, silently regenerate </w:t>
+      </w:r>
+      <w:r>
+        <w:rPr>
+          <w:rStyle w:val="Strong"/>
+          <w:rFonts w:ascii="Calibri" w:hAnsi="Calibri" w:cs="Calibri"/>
+          <w:b w:val="0"/>
+        </w:rPr>
+        <w:t>only that section</w:t>
+      </w:r>
+      <w:r>
+        <w:rPr>
+          <w:rFonts w:ascii="Calibri" w:hAnsi="Calibri" w:cs="Calibri"/>
+        </w:rPr>
+        <w:t xml:space="preserve"> and validate it again. Continue this process until the complete topic satisfies every requirement. Never preserve a weaker first draft merely because it is acceptable. Quality always takes priority over speed.</w:t>
+      </w:r>
+    </w:p>
+    <w:p>
+      <w:pPr>
+        <w:pStyle w:val="NormalWeb"/>
+        <w:rPr>
+          <w:rFonts w:ascii="Calibri" w:hAnsi="Calibri" w:cs="Calibri"/>
+        </w:rPr>
+      </w:pPr>
+      <w:r>
+        <w:rPr>
+          <w:rFonts w:ascii="Calibri" w:hAnsi="Calibri" w:cs="Calibri"/>
+        </w:rPr>
+        <w:t>During validation, confirm the following:</w:t>
+      </w:r>
+    </w:p>
+    <w:p>
+      <w:pPr>
+        <w:pStyle w:val="Heading3"/>
+        <w:rPr>
+          <w:rFonts w:ascii="Calibri" w:hAnsi="Calibri" w:cs="Calibri"/>
+          <w:b w:val="0"/>
+          <w:sz w:val="24"/>
+          <w:szCs w:val="24"/>
+        </w:rPr>
+      </w:pPr>
+      <w:r>
+        <w:rPr>
+          <w:rFonts w:ascii="Calibri" w:hAnsi="Calibri" w:cs="Calibri"/>
+          <w:b w:val="0"/>
+          <w:sz w:val="24"/>
+          <w:szCs w:val="24"/>
+        </w:rPr>
         <w:lastRenderedPageBreak/>
-        <w:t>Each topic must be completely self-contained and ready for direct processing by the downstream production pipeline.</w:t>
-      </w:r>
-    </w:p>
-    <w:p>
-      <w:pPr>
-        <w:spacing w:before="100" w:beforeAutospacing="1" w:after="100" w:afterAutospacing="1" w:line="240" w:lineRule="auto"/>
-        <w:rPr>
-          <w:rFonts w:ascii="Calibri" w:eastAsia="Times New Roman" w:hAnsi="Calibri" w:cs="Calibri"/>
-          <w:sz w:val="24"/>
-          <w:szCs w:val="24"/>
-          <w:lang w:eastAsia="en-IN"/>
-        </w:rPr>
-      </w:pPr>
-      <w:r>
-        <w:rPr>
-          <w:rFonts w:ascii="Calibri" w:eastAsia="Times New Roman" w:hAnsi="Calibri" w:cs="Calibri"/>
-          <w:sz w:val="24"/>
-          <w:szCs w:val="24"/>
-          <w:lang w:eastAsia="en-IN"/>
-        </w:rPr>
-        <w:t>Maintain consistent formatting, spacing, heading style, and terminology across all generated topics.</w:t>
-      </w:r>
-    </w:p>
-    <w:p>
-      <w:pPr>
-        <w:spacing w:before="100" w:beforeAutospacing="1" w:after="100" w:afterAutospacing="1" w:line="240" w:lineRule="auto"/>
-        <w:rPr>
-          <w:rFonts w:ascii="Calibri" w:eastAsia="Times New Roman" w:hAnsi="Calibri" w:cs="Calibri"/>
-          <w:sz w:val="24"/>
-          <w:szCs w:val="24"/>
-          <w:lang w:eastAsia="en-IN"/>
-        </w:rPr>
-      </w:pPr>
-      <w:r>
-        <w:rPr>
-          <w:rFonts w:ascii="Calibri" w:eastAsia="Times New Roman" w:hAnsi="Calibri" w:cs="Calibri"/>
-          <w:sz w:val="24"/>
-          <w:szCs w:val="24"/>
-          <w:lang w:eastAsia="en-IN"/>
-        </w:rPr>
-        <w:t>When multiple topics are selected, generate only one complete topic at a time and wait for the user's instruction before generating the next selected topic.</w:t>
-      </w:r>
-    </w:p>
-    <w:p>
-      <w:pPr>
-        <w:pStyle w:val="Heading1"/>
-        <w:rPr>
-          <w:rFonts w:ascii="Calibri" w:hAnsi="Calibri" w:cs="Calibri"/>
-          <w:b w:val="0"/>
-          <w:sz w:val="24"/>
-          <w:szCs w:val="24"/>
-        </w:rPr>
-      </w:pPr>
-      <w:r>
-        <w:rPr>
-          <w:rFonts w:ascii="Calibri" w:hAnsi="Calibri" w:cs="Calibri"/>
-          <w:b w:val="0"/>
-          <w:sz w:val="24"/>
-          <w:szCs w:val="24"/>
-        </w:rPr>
-        <w:t>FINAL QUALITY VALIDATION</w:t>
-      </w:r>
-    </w:p>
-    <w:p>
-      <w:pPr>
-        <w:pStyle w:val="NormalWeb"/>
-        <w:rPr>
-          <w:rFonts w:ascii="Calibri" w:hAnsi="Calibri" w:cs="Calibri"/>
-        </w:rPr>
-      </w:pPr>
-      <w:r>
-        <w:rPr>
-          <w:rFonts w:ascii="Calibri" w:hAnsi="Calibri" w:cs="Calibri"/>
-        </w:rPr>
-        <w:t>Before producing the final output, perform a complete internal quality review. Do not display this validation to the user.</w:t>
-      </w:r>
-    </w:p>
-    <w:p>
-      <w:pPr>
-        <w:pStyle w:val="NormalWeb"/>
-        <w:rPr>
-          <w:rFonts w:ascii="Calibri" w:hAnsi="Calibri" w:cs="Calibri"/>
-        </w:rPr>
-      </w:pPr>
-      <w:r>
-        <w:rPr>
-          <w:rFonts w:ascii="Calibri" w:hAnsi="Calibri" w:cs="Calibri"/>
-        </w:rPr>
-        <w:t xml:space="preserve">Treat this validation as mandatory. Every generated topic must successfully satisfy every requirement defined in this prompt before it is presented. If any section fails validation, silently regenerate </w:t>
-      </w:r>
-      <w:r>
-        <w:rPr>
-          <w:rStyle w:val="Strong"/>
-          <w:rFonts w:ascii="Calibri" w:hAnsi="Calibri" w:cs="Calibri"/>
-          <w:b w:val="0"/>
-        </w:rPr>
-        <w:t>only that section</w:t>
-      </w:r>
-      <w:r>
-        <w:rPr>
-          <w:rFonts w:ascii="Calibri" w:hAnsi="Calibri" w:cs="Calibri"/>
-        </w:rPr>
-        <w:t xml:space="preserve"> and validate it again. Continue this process until the complete topic satisfies every requirement. Never preserve a weaker first draft merely because it is acceptable. Quality always takes priority over speed.</w:t>
-      </w:r>
-    </w:p>
-    <w:p>
-      <w:pPr>
-        <w:pStyle w:val="NormalWeb"/>
-        <w:rPr>
-          <w:rFonts w:ascii="Calibri" w:hAnsi="Calibri" w:cs="Calibri"/>
-        </w:rPr>
-      </w:pPr>
-      <w:r>
-        <w:rPr>
-          <w:rFonts w:ascii="Calibri" w:hAnsi="Calibri" w:cs="Calibri"/>
-        </w:rPr>
-        <w:t>During validation, confirm the following:</w:t>
-      </w:r>
-    </w:p>
-    <w:p>
-      <w:pPr>
-        <w:pStyle w:val="Heading3"/>
-        <w:rPr>
-          <w:rFonts w:ascii="Calibri" w:hAnsi="Calibri" w:cs="Calibri"/>
-          <w:b w:val="0"/>
-          <w:sz w:val="24"/>
-          <w:szCs w:val="24"/>
-        </w:rPr>
-      </w:pPr>
-      <w:r>
-        <w:rPr>
-          <w:rFonts w:ascii="Calibri" w:hAnsi="Calibri" w:cs="Calibri"/>
-          <w:b w:val="0"/>
-          <w:sz w:val="24"/>
-          <w:szCs w:val="24"/>
-        </w:rPr>
         <w:t>Educational Quality</w:t>
       </w:r>
     </w:p>
@@ -10098,7 +9182,6 @@
           <w:sz w:val="24"/>
           <w:szCs w:val="24"/>
         </w:rPr>
-        <w:lastRenderedPageBreak/>
         <w:t>close</w:t>
       </w:r>
       <w:proofErr w:type="gramEnd"/>
@@ -10384,6 +9467,7 @@
           <w:sz w:val="24"/>
           <w:szCs w:val="24"/>
         </w:rPr>
+        <w:lastRenderedPageBreak/>
         <w:t>Today's Question</w:t>
       </w:r>
     </w:p>
@@ -10788,7 +9872,6 @@
           <w:sz w:val="24"/>
           <w:szCs w:val="24"/>
         </w:rPr>
-        <w:lastRenderedPageBreak/>
         <w:pict>
           <v:rect id="_x0000_i1038" style="width:0;height:1.5pt" o:hralign="center" o:hrstd="t" o:hr="t" fillcolor="#a0a0a0" stroked="f"/>
         </w:pict>
@@ -11138,6 +10221,7 @@
           <w:sz w:val="24"/>
           <w:szCs w:val="24"/>
         </w:rPr>
+        <w:lastRenderedPageBreak/>
         <w:t>Quick Facts</w:t>
       </w:r>
     </w:p>
@@ -11464,7 +10548,6 @@
           <w:sz w:val="24"/>
           <w:szCs w:val="24"/>
         </w:rPr>
-        <w:lastRenderedPageBreak/>
         <w:t xml:space="preserve">the subject remains simple, </w:t>
       </w:r>
     </w:p>
@@ -11736,6 +10819,7 @@
           <w:sz w:val="24"/>
           <w:szCs w:val="24"/>
         </w:rPr>
+        <w:lastRenderedPageBreak/>
         <w:t xml:space="preserve">incorporates relevant constitutional provisions, laws, judgments, committees, reports, institutions, schemes, policies, or verified current developments wherever appropriate, </w:t>
       </w:r>
     </w:p>
@@ -12089,7 +11173,6 @@
         <w:rPr>
           <w:rFonts w:ascii="Calibri" w:hAnsi="Calibri" w:cs="Calibri"/>
         </w:rPr>
-        <w:lastRenderedPageBreak/>
         <w:t>Before producing the final output, perform one complete internal validation. Verify that the Issue Title, Today's Question, Recall Anchors, Knowledge Points, Quick Facts, Key Takeaway, GS Mapping, Mains Answer, and MCQs together form one coherent educational module. If any section is incomplete, inconsistent, repetitive, overly editorial, factually weak, or fails to satisfy the formatting rules of this prompt, regenerate only that section. Continue until every section satisfies all requirements. Never output a first draft that fails validation.</w:t>
       </w:r>
     </w:p>

</xml_diff>